<commit_message>
Align final delivery docs with production evidence
</commit_message>
<xml_diff>
--- a/docs/final-delivery/Docker Deployment Report.docx
+++ b/docs/final-delivery/Docker Deployment Report.docx
@@ -358,12 +358,12 @@
     </w:p>
     <w:p>
       <w:r>
-        <w:t>The deployment target described by the repository is a Linux host running Docker Engine and Docker Compose v2. The base stack is defined by docker-compose.yml. Full-stack release bundles can include docker-compose.ovos.yml to add the OVOS runtime and skill.</w:t>
+        <w:t>The deployment target described by the repository is a Linux host running Docker Engine and Docker Compose v2. The GitHub production base stack is defined by docker-compose.yml. The full-stack release notes describe an embedded OVOS runtime/skill directory under ovos-stack; the separate OVOS-EnMS repository provides its own Compose file.</w:t>
       </w:r>
     </w:p>
     <w:p>
       <w:r>
-        <w:t>The setup helper is the intended guided path. It creates .env from .env.example when needed, generates first-run secrets for placeholders, validates Docker Compose, builds images, and starts the stack. It also adjusts OVOS_BRIDGE_HOST when an OVOS overlay is present.</w:t>
+        <w:t>The setup helper is the intended guided path. It creates .env from .env.example when needed, generates first-run secrets for placeholders, validates Docker Compose, builds images, and starts the stack. It also adjusts OVOS_BRIDGE_HOST when an optional OVOS compose file is present.</w:t>
       </w:r>
     </w:p>
     <w:p>
@@ -424,7 +424,7 @@
     </w:p>
     <w:p>
       <w:r>
-        <w:t>The base deployment uses one Docker bridge network for HumanEnerDIA services. Nginx is the browser/API gateway; analytics, auth-service, chatbot/Rasa, simulator, Node-RED, Grafana, PostgreSQL/TimescaleDB, MQTT, and Redis communicate on the internal network. OVOS can be added as a separate service joined to the same network.</w:t>
+        <w:t>The base deployment uses one Docker bridge network for HumanEnerDIA services. Nginx is the browser/API gateway; analytics, auth-service, chatbot/Rasa, simulator, Node-RED, Grafana, PostgreSQL/TimescaleDB, MQTT, and Redis communicate on the internal network. OVOS-EnMS remains a separate assistant runtime in the GitHub production evidence and connects through the HumanEnerDIA-compatible API.</w:t>
       </w:r>
     </w:p>
     <w:p>
@@ -1208,88 +1208,6 @@
                 <w:b w:val="0"/>
                 <w:sz w:val="17"/>
               </w:rPr>
-              <w:t>query-service</w:t>
-            </w:r>
-          </w:p>
-        </w:tc>
-        <w:tc>
-          <w:tcPr>
-            <w:tcW w:type="dxa" w:w="2074"/>
-            <w:vAlign w:val="top"/>
-          </w:tcPr>
-          <w:p>
-            <w:r/>
-            <w:r>
-              <w:rPr>
-                <w:b w:val="0"/>
-                <w:sz w:val="17"/>
-              </w:rPr>
-              <w:t>build ./query-service</w:t>
-            </w:r>
-          </w:p>
-        </w:tc>
-        <w:tc>
-          <w:tcPr>
-            <w:tcW w:type="dxa" w:w="2074"/>
-            <w:vAlign w:val="top"/>
-          </w:tcPr>
-          <w:p>
-            <w:r/>
-            <w:r>
-              <w:rPr>
-                <w:b w:val="0"/>
-                <w:sz w:val="17"/>
-              </w:rPr>
-              <w:t>8002</w:t>
-            </w:r>
-          </w:p>
-        </w:tc>
-        <w:tc>
-          <w:tcPr>
-            <w:tcW w:type="dxa" w:w="2074"/>
-            <w:vAlign w:val="top"/>
-          </w:tcPr>
-          <w:p>
-            <w:r/>
-            <w:r>
-              <w:rPr>
-                <w:b w:val="0"/>
-                <w:sz w:val="17"/>
-              </w:rPr>
-              <w:t>Reserved placeholder; healthcheck disabled and not a readiness signal</w:t>
-            </w:r>
-          </w:p>
-        </w:tc>
-        <w:tc>
-          <w:tcPr>
-            <w:tcW w:type="dxa" w:w="2074"/>
-            <w:vAlign w:val="top"/>
-          </w:tcPr>
-          <w:p>
-            <w:r/>
-            <w:r>
-              <w:rPr>
-                <w:b w:val="0"/>
-                <w:sz w:val="17"/>
-              </w:rPr>
-              <w:t>No</w:t>
-            </w:r>
-          </w:p>
-        </w:tc>
-      </w:tr>
-      <w:tr>
-        <w:tc>
-          <w:tcPr>
-            <w:tcW w:type="dxa" w:w="2074"/>
-            <w:vAlign w:val="top"/>
-          </w:tcPr>
-          <w:p>
-            <w:r/>
-            <w:r>
-              <w:rPr>
-                <w:b w:val="0"/>
-                <w:sz w:val="17"/>
-              </w:rPr>
               <w:t>auth-service</w:t>
             </w:r>
           </w:p>
@@ -1617,12 +1535,12 @@
     </w:p>
     <w:p>
       <w:r>
-        <w:t>All core services join the Docker bridge network named by ENMS_NETWORK_NAME, defaulting to enms-network. The OVOS overlay also joins that network and depends on analytics service health.</w:t>
+        <w:t>All HumanEnerDIA production Compose services join the Docker bridge network named by ENMS_NETWORK_NAME, defaulting to enms-network. OVOS-EnMS is documented as a separate assistant runtime and release-bundle component rather than a service in the GitHub production base docker-compose.yml.</w:t>
       </w:r>
     </w:p>
     <w:p>
       <w:r>
-        <w:t>Persistent named volumes include PostgreSQL data, MQTT data/logs, Redis data, Node-RED data, Grafana data, and OVOS/supervisor logs when the OVOS overlay is used.</w:t>
+        <w:t>Persistent named volumes in the production Compose file include PostgreSQL data, MQTT data/logs, Redis data, Node-RED data, and Grafana data.</w:t>
       </w:r>
     </w:p>
     <w:tbl>
@@ -1939,56 +1857,6 @@
                 <w:sz w:val="17"/>
               </w:rPr>
               <w:t>Mosquitto runtime data and logs</w:t>
-            </w:r>
-          </w:p>
-        </w:tc>
-      </w:tr>
-      <w:tr>
-        <w:tc>
-          <w:tcPr>
-            <w:tcW w:type="dxa" w:w="3456"/>
-            <w:vAlign w:val="top"/>
-          </w:tcPr>
-          <w:p>
-            <w:r/>
-            <w:r>
-              <w:rPr>
-                <w:b w:val="0"/>
-                <w:sz w:val="17"/>
-              </w:rPr>
-              <w:t>ovos-logs</w:t>
-            </w:r>
-          </w:p>
-        </w:tc>
-        <w:tc>
-          <w:tcPr>
-            <w:tcW w:type="dxa" w:w="3456"/>
-            <w:vAlign w:val="top"/>
-          </w:tcPr>
-          <w:p>
-            <w:r/>
-            <w:r>
-              <w:rPr>
-                <w:b w:val="0"/>
-                <w:sz w:val="17"/>
-              </w:rPr>
-              <w:t>${VOLUME_PREFIX:-enms}-ovos-logs</w:t>
-            </w:r>
-          </w:p>
-        </w:tc>
-        <w:tc>
-          <w:tcPr>
-            <w:tcW w:type="dxa" w:w="3456"/>
-            <w:vAlign w:val="top"/>
-          </w:tcPr>
-          <w:p>
-            <w:r/>
-            <w:r>
-              <w:rPr>
-                <w:b w:val="0"/>
-                <w:sz w:val="17"/>
-              </w:rPr>
-              <w:t>OVOS runtime logs when overlay deployed</w:t>
             </w:r>
           </w:p>
         </w:tc>
@@ -2564,7 +2432,7 @@
                 <w:b w:val="0"/>
                 <w:sz w:val="17"/>
               </w:rPr>
-              <w:t>docker compose -f /home/ubuntu/ovos-llm/docker-compose.yml config --quiet</w:t>
+              <w:t>OVOS-EnMS repository docker-compose.yml</w:t>
             </w:r>
           </w:p>
         </w:tc>
@@ -2580,7 +2448,7 @@
                 <w:b w:val="0"/>
                 <w:sz w:val="17"/>
               </w:rPr>
-              <w:t>Validate OVOS-only compose</w:t>
+              <w:t>Validate OVOS assistant Compose configuration separately</w:t>
             </w:r>
           </w:p>
         </w:tc>
@@ -2596,7 +2464,7 @@
                 <w:b w:val="0"/>
                 <w:sz w:val="17"/>
               </w:rPr>
-              <w:t>Ran successfully.</w:t>
+              <w:t>Ran successfully during documentation review.</w:t>
             </w:r>
           </w:p>
         </w:tc>
@@ -2614,7 +2482,7 @@
                 <w:b w:val="0"/>
                 <w:sz w:val="17"/>
               </w:rPr>
-              <w:t>scripts/verify-wasabi-release.sh --skip-shop</w:t>
+              <w:t>verify.sh</w:t>
             </w:r>
           </w:p>
         </w:tc>
@@ -2630,7 +2498,7 @@
                 <w:b w:val="0"/>
                 <w:sz w:val="17"/>
               </w:rPr>
-              <w:t>Checks Nginx, analytics, OVOS bridge, OVOS smoke query when services are running</w:t>
+              <w:t>Checks Compose config and live Nginx, analytics, and optional OVOS endpoints when a stack is running</w:t>
             </w:r>
           </w:p>
         </w:tc>
@@ -2646,7 +2514,7 @@
                 <w:b w:val="0"/>
                 <w:sz w:val="17"/>
               </w:rPr>
-              <w:t>Script inspected; not run because runtime stack health was not established.</w:t>
+              <w:t>Script exists in production repository; live checks were not run in this pass.</w:t>
             </w:r>
           </w:p>
         </w:tc>
@@ -2664,7 +2532,7 @@
                 <w:b w:val="0"/>
                 <w:sz w:val="17"/>
               </w:rPr>
-              <w:t>scripts/validate_api_documentation.sh</w:t>
+              <w:t>scripts/test_chatbot_comprehensive.sh</w:t>
             </w:r>
           </w:p>
         </w:tc>
@@ -2680,7 +2548,7 @@
                 <w:b w:val="0"/>
                 <w:sz w:val="17"/>
               </w:rPr>
-              <w:t>Checks critical analytics/API documentation endpoints against a running service</w:t>
+              <w:t>Exercises chatbot/Rasa behavior when services are running</w:t>
             </w:r>
           </w:p>
         </w:tc>
@@ -2696,7 +2564,7 @@
                 <w:b w:val="0"/>
                 <w:sz w:val="17"/>
               </w:rPr>
-              <w:t>Script inspected; not run because it requires live analytics and test data.</w:t>
+              <w:t>Script exists; not run because it requires live services.</w:t>
             </w:r>
           </w:p>
         </w:tc>
@@ -2730,7 +2598,7 @@
                 <w:b w:val="0"/>
                 <w:sz w:val="17"/>
               </w:rPr>
-              <w:t>Container-level checks for most services</w:t>
+              <w:t>Container-level checks for all production Compose services</w:t>
             </w:r>
           </w:p>
         </w:tc>
@@ -2746,7 +2614,7 @@
                 <w:b w:val="0"/>
                 <w:sz w:val="17"/>
               </w:rPr>
-              <w:t>Configured in docker-compose.yml; query-service disabled.</w:t>
+              <w:t>Configured in docker-compose.yml.</w:t>
             </w:r>
           </w:p>
         </w:tc>
@@ -3134,56 +3002,6 @@
           </w:p>
         </w:tc>
       </w:tr>
-      <w:tr>
-        <w:tc>
-          <w:tcPr>
-            <w:tcW w:type="dxa" w:w="3456"/>
-            <w:vAlign w:val="top"/>
-          </w:tcPr>
-          <w:p>
-            <w:r/>
-            <w:r>
-              <w:rPr>
-                <w:b w:val="0"/>
-                <w:sz w:val="17"/>
-              </w:rPr>
-              <w:t>query-service health missing</w:t>
-            </w:r>
-          </w:p>
-        </w:tc>
-        <w:tc>
-          <w:tcPr>
-            <w:tcW w:type="dxa" w:w="3456"/>
-            <w:vAlign w:val="top"/>
-          </w:tcPr>
-          <w:p>
-            <w:r/>
-            <w:r>
-              <w:rPr>
-                <w:b w:val="0"/>
-                <w:sz w:val="17"/>
-              </w:rPr>
-              <w:t>Expected placeholder state</w:t>
-            </w:r>
-          </w:p>
-        </w:tc>
-        <w:tc>
-          <w:tcPr>
-            <w:tcW w:type="dxa" w:w="3456"/>
-            <w:vAlign w:val="top"/>
-          </w:tcPr>
-          <w:p>
-            <w:r/>
-            <w:r>
-              <w:rPr>
-                <w:b w:val="0"/>
-                <w:sz w:val="17"/>
-              </w:rPr>
-              <w:t>Do not use query-service as readiness blocker.</w:t>
-            </w:r>
-          </w:p>
-        </w:tc>
-      </w:tr>
     </w:tbl>
     <w:p/>
     <w:p>
@@ -3262,40 +3080,6 @@
                 <w:b w:val="0"/>
                 <w:sz w:val="17"/>
               </w:rPr>
-              <w:t>query-service</w:t>
-            </w:r>
-          </w:p>
-        </w:tc>
-        <w:tc>
-          <w:tcPr>
-            <w:tcW w:type="dxa" w:w="5184"/>
-            <w:vAlign w:val="top"/>
-          </w:tcPr>
-          <w:p>
-            <w:r/>
-            <w:r>
-              <w:rPr>
-                <w:b w:val="0"/>
-                <w:sz w:val="17"/>
-              </w:rPr>
-              <w:t>Placeholder only; Docker service exists, healthcheck disabled, and it is excluded from release readiness expectations.</w:t>
-            </w:r>
-          </w:p>
-        </w:tc>
-      </w:tr>
-      <w:tr>
-        <w:tc>
-          <w:tcPr>
-            <w:tcW w:type="dxa" w:w="5184"/>
-            <w:vAlign w:val="top"/>
-          </w:tcPr>
-          <w:p>
-            <w:r/>
-            <w:r>
-              <w:rPr>
-                <w:b w:val="0"/>
-                <w:sz w:val="17"/>
-              </w:rPr>
               <w:t>Runtime verification</w:t>
             </w:r>
           </w:p>
@@ -3330,6 +3114,40 @@
                 <w:b w:val="0"/>
                 <w:sz w:val="17"/>
               </w:rPr>
+              <w:t>OVOS deployment boundary</w:t>
+            </w:r>
+          </w:p>
+        </w:tc>
+        <w:tc>
+          <w:tcPr>
+            <w:tcW w:type="dxa" w:w="5184"/>
+            <w:vAlign w:val="top"/>
+          </w:tcPr>
+          <w:p>
+            <w:r/>
+            <w:r>
+              <w:rPr>
+                <w:b w:val="0"/>
+                <w:sz w:val="17"/>
+              </w:rPr>
+              <w:t>The GitHub production base docker-compose.yml does not define an OVOS service. OVOS-EnMS is documented as a separate source repository and as an embedded component in the full-stack release archive.</w:t>
+            </w:r>
+          </w:p>
+        </w:tc>
+      </w:tr>
+      <w:tr>
+        <w:tc>
+          <w:tcPr>
+            <w:tcW w:type="dxa" w:w="5184"/>
+            <w:vAlign w:val="top"/>
+          </w:tcPr>
+          <w:p>
+            <w:r/>
+            <w:r>
+              <w:rPr>
+                <w:b w:val="0"/>
+                <w:sz w:val="17"/>
+              </w:rPr>
               <w:t>OVOS release artifact</w:t>
             </w:r>
           </w:p>
@@ -3346,7 +3164,7 @@
                 <w:b w:val="0"/>
                 <w:sz w:val="17"/>
               </w:rPr>
-              <w:t>The OVOS source tree may contain local GGUF model files, but release notes state optional GGUF weights are not bundled by default.</w:t>
+              <w:t>Release notes state optional GGUF model weights are not bundled by default.</w:t>
             </w:r>
           </w:p>
         </w:tc>
@@ -3599,40 +3417,6 @@
                 <w:b w:val="0"/>
                 <w:sz w:val="17"/>
               </w:rPr>
-              <w:t>OVOS overlay</w:t>
-            </w:r>
-          </w:p>
-        </w:tc>
-        <w:tc>
-          <w:tcPr>
-            <w:tcW w:type="dxa" w:w="5184"/>
-            <w:vAlign w:val="top"/>
-          </w:tcPr>
-          <w:p>
-            <w:r/>
-            <w:r>
-              <w:rPr>
-                <w:b w:val="0"/>
-                <w:sz w:val="17"/>
-              </w:rPr>
-              <w:t>scripts/release/docker-compose.ovos.yml</w:t>
-            </w:r>
-          </w:p>
-        </w:tc>
-      </w:tr>
-      <w:tr>
-        <w:tc>
-          <w:tcPr>
-            <w:tcW w:type="dxa" w:w="5184"/>
-            <w:vAlign w:val="top"/>
-          </w:tcPr>
-          <w:p>
-            <w:r/>
-            <w:r>
-              <w:rPr>
-                <w:b w:val="0"/>
-                <w:sz w:val="17"/>
-              </w:rPr>
               <w:t>Setup helper</w:t>
             </w:r>
           </w:p>
@@ -3683,7 +3467,7 @@
                 <w:b w:val="0"/>
                 <w:sz w:val="17"/>
               </w:rPr>
-              <w:t>scripts/verify-wasabi-release.sh</w:t>
+              <w:t>verify.sh</w:t>
             </w:r>
           </w:p>
         </w:tc>
@@ -3701,7 +3485,7 @@
                 <w:b w:val="0"/>
                 <w:sz w:val="17"/>
               </w:rPr>
-              <w:t>Operations</w:t>
+              <w:t>Release notes</w:t>
             </w:r>
           </w:p>
         </w:tc>
@@ -3717,7 +3501,7 @@
                 <w:b w:val="0"/>
                 <w:sz w:val="17"/>
               </w:rPr>
-              <w:t>docs/OPERATIONS_RUNBOOK.md; docs/DELIVERY_READINESS.md</w:t>
+              <w:t>releases/HumanEnerDIA-full-stack-v1.0.0-release-notes.md</w:t>
             </w:r>
           </w:p>
         </w:tc>
@@ -3751,7 +3535,7 @@
                 <w:b w:val="0"/>
                 <w:sz w:val="17"/>
               </w:rPr>
-              <w:t>/home/ubuntu/ovos-llm/Dockerfile; /home/ubuntu/ovos-llm/docker-compose.yml</w:t>
+              <w:t>OVOS-EnMS repository: docker-compose.yml; Dockerfile; enms-ovos-skill/config.yaml.template; enms-ovos-skill/settings.docker.json; enms-ovos-skill/settingsmeta.yaml</w:t>
             </w:r>
           </w:p>
         </w:tc>

</xml_diff>

<commit_message>
Polish final delivery docs for stakeholder-facing language
</commit_message>
<xml_diff>
--- a/docs/final-delivery/Docker Deployment Report.docx
+++ b/docs/final-delivery/Docker Deployment Report.docx
@@ -229,7 +229,7 @@
         <w:t xml:space="preserve">Source basis: </w:t>
       </w:r>
       <w:r>
-        <w:t>Deployment claims are based on compose files, Dockerfiles, setup and verification scripts, and local compose validation.</w:t>
+        <w:t>Deployment claims are based on compose files, Dockerfiles, setup and verification scripts, and compose validation.</w:t>
       </w:r>
     </w:p>
     <w:p>
@@ -419,6 +419,11 @@
         <w:t>The repository does not install host Docker itself. Operators should prepare the host and confirm prerequisite tooling before running setup or Compose commands.</w:t>
       </w:r>
     </w:p>
+    <w:p>
+      <w:r>
+        <w:t>The prerequisite table defines the host and tooling conditions needed before installation or startup.</w:t>
+      </w:r>
+    </w:p>
     <w:tbl>
       <w:tblPr>
         <w:tblStyle w:val="TableGrid"/>
@@ -737,6 +742,11 @@
       </w:tr>
     </w:tbl>
     <w:p/>
+    <w:p>
+      <w:r>
+        <w:t>Meeting these prerequisites reduces avoidable installation failures and gives operators the minimum environment needed for a clean first run.</w:t>
+      </w:r>
+    </w:p>
     <w:p>
       <w:pPr>
         <w:pStyle w:val="Heading1"/>
@@ -795,7 +805,7 @@
     </w:p>
     <w:p>
       <w:r>
-        <w:t>The base deployment uses one Docker bridge network for HumanEnerDIA services. Nginx is the browser/API gateway; analytics, auth-service, chatbot/Rasa, simulator, Node-RED, Grafana, PostgreSQL/TimescaleDB, MQTT, and Redis communicate on the internal network. OVOS-EnMS remains a separate assistant runtime in the GitHub production evidence and connects through the HumanEnerDIA-compatible API.</w:t>
+        <w:t>The base deployment uses one Docker bridge network for HumanEnerDIA services. Nginx is the browser/API gateway; analytics, auth-service, chatbot/Rasa, simulator, Node-RED, Grafana, PostgreSQL/TimescaleDB, MQTT, and Redis communicate on the internal network. OVOS-EnMS remains a separate assistant runtime in the tracked production source and connects through the HumanEnerDIA-compatible API.</w:t>
       </w:r>
     </w:p>
     <w:p>
@@ -804,6 +814,11 @@
       </w:pPr>
       <w:r>
         <w:t>Docker Compose Services</w:t>
+      </w:r>
+    </w:p>
+    <w:p>
+      <w:r>
+        <w:t>The service table is the operator's runtime inventory for base HumanEnerDIA deployment.</w:t>
       </w:r>
     </w:p>
     <w:tbl>
@@ -1949,6 +1964,11 @@
     </w:tbl>
     <w:p/>
     <w:p>
+      <w:r>
+        <w:t>The service inventory is also the troubleshooting map: when a function fails, operators can locate the owning service and supporting dependencies.</w:t>
+      </w:r>
+    </w:p>
+    <w:p>
       <w:pPr>
         <w:pStyle w:val="Heading1"/>
       </w:pPr>
@@ -1964,6 +1984,11 @@
     <w:p>
       <w:r>
         <w:t>Persistent named volumes in the production Compose file include PostgreSQL data, MQTT data/logs, Redis data, Node-RED data, and Grafana data.</w:t>
+      </w:r>
+    </w:p>
+    <w:p>
+      <w:r>
+        <w:t>This table identifies the persistent and network resources that influence backup, firewall, and redeployment planning.</w:t>
       </w:r>
     </w:p>
     <w:tbl>
@@ -2311,6 +2336,11 @@
       </w:tr>
     </w:tbl>
     <w:p/>
+    <w:p>
+      <w:r>
+        <w:t>These resources define the main persistence and exposure points. They require careful handling during backup, cleanup, and public deployment.</w:t>
+      </w:r>
+    </w:p>
     <w:p>
       <w:pPr>
         <w:pStyle w:val="Heading1"/>
@@ -2366,415 +2396,9 @@
         <w:t>The table below summarizes configuration groups without reproducing private runtime values. Use .env.example and setup.sh as the source for expected keys.</w:t>
       </w:r>
     </w:p>
-    <w:tbl>
-      <w:tblPr>
-        <w:tblStyle w:val="TableGrid"/>
-        <w:tblW w:type="auto" w:w="0"/>
-        <w:jc w:val="center"/>
-        <w:tblLook w:firstColumn="1" w:firstRow="1" w:lastColumn="0" w:lastRow="0" w:noHBand="0" w:noVBand="1" w:val="04A0"/>
-      </w:tblPr>
-      <w:tblGrid>
-        <w:gridCol w:w="3552"/>
-        <w:gridCol w:w="3552"/>
-        <w:gridCol w:w="3552"/>
-      </w:tblGrid>
-      <w:tr>
-        <w:trPr>
-          <w:tblHeader w:val="true"/>
-          <w:cantSplit/>
-        </w:trPr>
-        <w:tc>
-          <w:tcPr>
-            <w:tcW w:type="dxa" w:w="3552"/>
-            <w:vAlign w:val="top"/>
-            <w:shd w:fill="D9EAF7"/>
-          </w:tcPr>
-          <w:p>
-            <w:r/>
-            <w:r>
-              <w:rPr>
-                <w:b/>
-                <w:sz w:val="17"/>
-              </w:rPr>
-              <w:t>Group</w:t>
-            </w:r>
-          </w:p>
-        </w:tc>
-        <w:tc>
-          <w:tcPr>
-            <w:tcW w:type="dxa" w:w="3552"/>
-            <w:vAlign w:val="top"/>
-            <w:shd w:fill="D9EAF7"/>
-          </w:tcPr>
-          <w:p>
-            <w:r/>
-            <w:r>
-              <w:rPr>
-                <w:b/>
-                <w:sz w:val="17"/>
-              </w:rPr>
-              <w:t>Representative variables</w:t>
-            </w:r>
-          </w:p>
-        </w:tc>
-        <w:tc>
-          <w:tcPr>
-            <w:tcW w:type="dxa" w:w="3552"/>
-            <w:vAlign w:val="top"/>
-            <w:shd w:fill="D9EAF7"/>
-          </w:tcPr>
-          <w:p>
-            <w:r/>
-            <w:r>
-              <w:rPr>
-                <w:b/>
-                <w:sz w:val="17"/>
-              </w:rPr>
-              <w:t>Source basis</w:t>
-            </w:r>
-          </w:p>
-        </w:tc>
-      </w:tr>
-      <w:tr>
-        <w:trPr>
-          <w:cantSplit/>
-        </w:trPr>
-        <w:tc>
-          <w:tcPr>
-            <w:tcW w:type="dxa" w:w="3552"/>
-            <w:vAlign w:val="top"/>
-          </w:tcPr>
-          <w:p>
-            <w:r/>
-            <w:r>
-              <w:rPr>
-                <w:b w:val="0"/>
-                <w:sz w:val="17"/>
-              </w:rPr>
-              <w:t>Database</w:t>
-            </w:r>
-          </w:p>
-        </w:tc>
-        <w:tc>
-          <w:tcPr>
-            <w:tcW w:type="dxa" w:w="3552"/>
-            <w:vAlign w:val="top"/>
-          </w:tcPr>
-          <w:p>
-            <w:r/>
-            <w:r>
-              <w:rPr>
-                <w:b w:val="0"/>
-                <w:sz w:val="17"/>
-              </w:rPr>
-              <w:t>POSTGRES_USER, POSTGRES_PASSWORD, POSTGRES_DB, POSTGRES_HOST, POSTGRES_PORT</w:t>
-            </w:r>
-          </w:p>
-        </w:tc>
-        <w:tc>
-          <w:tcPr>
-            <w:tcW w:type="dxa" w:w="3552"/>
-            <w:vAlign w:val="top"/>
-          </w:tcPr>
-          <w:p>
-            <w:r/>
-            <w:r>
-              <w:rPr>
-                <w:b w:val="0"/>
-                <w:sz w:val="17"/>
-              </w:rPr>
-              <w:t>.env.example; docker-compose.yml; analytics/config.py</w:t>
-            </w:r>
-          </w:p>
-        </w:tc>
-      </w:tr>
-      <w:tr>
-        <w:trPr>
-          <w:cantSplit/>
-        </w:trPr>
-        <w:tc>
-          <w:tcPr>
-            <w:tcW w:type="dxa" w:w="3552"/>
-            <w:vAlign w:val="top"/>
-          </w:tcPr>
-          <w:p>
-            <w:r/>
-            <w:r>
-              <w:rPr>
-                <w:b w:val="0"/>
-                <w:sz w:val="17"/>
-              </w:rPr>
-              <w:t>Service ports</w:t>
-            </w:r>
-          </w:p>
-        </w:tc>
-        <w:tc>
-          <w:tcPr>
-            <w:tcW w:type="dxa" w:w="3552"/>
-            <w:vAlign w:val="top"/>
-          </w:tcPr>
-          <w:p>
-            <w:r/>
-            <w:r>
-              <w:rPr>
-                <w:b w:val="0"/>
-                <w:sz w:val="17"/>
-              </w:rPr>
-              <w:t>NGINX_HTTP_PORT, ANALYTICS_PORT, SIMULATOR_PORT, GRAFANA_PORT, NODERED_PORT, RASA_PORT, CHATBOT_PORT, REDIS_EXTERNAL_PORT</w:t>
-            </w:r>
-          </w:p>
-        </w:tc>
-        <w:tc>
-          <w:tcPr>
-            <w:tcW w:type="dxa" w:w="3552"/>
-            <w:vAlign w:val="top"/>
-          </w:tcPr>
-          <w:p>
-            <w:r/>
-            <w:r>
-              <w:rPr>
-                <w:b w:val="0"/>
-                <w:sz w:val="17"/>
-              </w:rPr>
-              <w:t>.env.example; docker-compose.yml</w:t>
-            </w:r>
-          </w:p>
-        </w:tc>
-      </w:tr>
-      <w:tr>
-        <w:trPr>
-          <w:cantSplit/>
-        </w:trPr>
-        <w:tc>
-          <w:tcPr>
-            <w:tcW w:type="dxa" w:w="3552"/>
-            <w:vAlign w:val="top"/>
-          </w:tcPr>
-          <w:p>
-            <w:r/>
-            <w:r>
-              <w:rPr>
-                <w:b w:val="0"/>
-                <w:sz w:val="17"/>
-              </w:rPr>
-              <w:t>Security and auth</w:t>
-            </w:r>
-          </w:p>
-        </w:tc>
-        <w:tc>
-          <w:tcPr>
-            <w:tcW w:type="dxa" w:w="3552"/>
-            <w:vAlign w:val="top"/>
-          </w:tcPr>
-          <w:p>
-            <w:r/>
-            <w:r>
-              <w:rPr>
-                <w:b w:val="0"/>
-                <w:sz w:val="17"/>
-              </w:rPr>
-              <w:t>JWT_SECRET, API_KEY, ADMIN_EMAILS, JWT expiration settings, Node-RED password hash/credential secret</w:t>
-            </w:r>
-          </w:p>
-        </w:tc>
-        <w:tc>
-          <w:tcPr>
-            <w:tcW w:type="dxa" w:w="3552"/>
-            <w:vAlign w:val="top"/>
-          </w:tcPr>
-          <w:p>
-            <w:r/>
-            <w:r>
-              <w:rPr>
-                <w:b w:val="0"/>
-                <w:sz w:val="17"/>
-              </w:rPr>
-              <w:t>.env.example; auth-service/auth_service.py; nodered/settings.js</w:t>
-            </w:r>
-          </w:p>
-        </w:tc>
-      </w:tr>
-      <w:tr>
-        <w:trPr>
-          <w:cantSplit/>
-        </w:trPr>
-        <w:tc>
-          <w:tcPr>
-            <w:tcW w:type="dxa" w:w="3552"/>
-            <w:vAlign w:val="top"/>
-          </w:tcPr>
-          <w:p>
-            <w:r/>
-            <w:r>
-              <w:rPr>
-                <w:b w:val="0"/>
-                <w:sz w:val="17"/>
-              </w:rPr>
-              <w:t>Telemetry</w:t>
-            </w:r>
-          </w:p>
-        </w:tc>
-        <w:tc>
-          <w:tcPr>
-            <w:tcW w:type="dxa" w:w="3552"/>
-            <w:vAlign w:val="top"/>
-          </w:tcPr>
-          <w:p>
-            <w:r/>
-            <w:r>
-              <w:rPr>
-                <w:b w:val="0"/>
-                <w:sz w:val="17"/>
-              </w:rPr>
-              <w:t>MQTT_HOST, MQTT_PORT, MQTT_USERNAME, MQTT_PASSWORD, simulator intervals and anomaly settings</w:t>
-            </w:r>
-          </w:p>
-        </w:tc>
-        <w:tc>
-          <w:tcPr>
-            <w:tcW w:type="dxa" w:w="3552"/>
-            <w:vAlign w:val="top"/>
-          </w:tcPr>
-          <w:p>
-            <w:r/>
-            <w:r>
-              <w:rPr>
-                <w:b w:val="0"/>
-                <w:sz w:val="17"/>
-              </w:rPr>
-              <w:t>.env.example; simulator/config.py</w:t>
-            </w:r>
-          </w:p>
-        </w:tc>
-      </w:tr>
-      <w:tr>
-        <w:trPr>
-          <w:cantSplit/>
-        </w:trPr>
-        <w:tc>
-          <w:tcPr>
-            <w:tcW w:type="dxa" w:w="3552"/>
-            <w:vAlign w:val="top"/>
-          </w:tcPr>
-          <w:p>
-            <w:pPr>
-              <w:keepNext/>
-            </w:pPr>
-            <w:r/>
-            <w:r>
-              <w:rPr>
-                <w:b w:val="0"/>
-                <w:sz w:val="17"/>
-              </w:rPr>
-              <w:t>Analytics behavior</w:t>
-            </w:r>
-          </w:p>
-        </w:tc>
-        <w:tc>
-          <w:tcPr>
-            <w:tcW w:type="dxa" w:w="3552"/>
-            <w:vAlign w:val="top"/>
-          </w:tcPr>
-          <w:p>
-            <w:pPr>
-              <w:keepNext/>
-            </w:pPr>
-            <w:r/>
-            <w:r>
-              <w:rPr>
-                <w:b w:val="0"/>
-                <w:sz w:val="17"/>
-              </w:rPr>
-              <w:t>LOG_LEVEL, scheduler settings, model storage, anomaly thresholds, cost/carbon defaults</w:t>
-            </w:r>
-          </w:p>
-        </w:tc>
-        <w:tc>
-          <w:tcPr>
-            <w:tcW w:type="dxa" w:w="3552"/>
-            <w:vAlign w:val="top"/>
-          </w:tcPr>
-          <w:p>
-            <w:pPr>
-              <w:keepNext/>
-            </w:pPr>
-            <w:r/>
-            <w:r>
-              <w:rPr>
-                <w:b w:val="0"/>
-                <w:sz w:val="17"/>
-              </w:rPr>
-              <w:t>analytics/config.py; .env.example</w:t>
-            </w:r>
-          </w:p>
-        </w:tc>
-      </w:tr>
-      <w:tr>
-        <w:trPr>
-          <w:cantSplit/>
-        </w:trPr>
-        <w:tc>
-          <w:tcPr>
-            <w:tcW w:type="dxa" w:w="3552"/>
-            <w:vAlign w:val="top"/>
-          </w:tcPr>
-          <w:p>
-            <w:r/>
-            <w:r>
-              <w:rPr>
-                <w:b w:val="0"/>
-                <w:sz w:val="17"/>
-              </w:rPr>
-              <w:t>OVOS proxy/runtime</w:t>
-            </w:r>
-          </w:p>
-        </w:tc>
-        <w:tc>
-          <w:tcPr>
-            <w:tcW w:type="dxa" w:w="3552"/>
-            <w:vAlign w:val="top"/>
-          </w:tcPr>
-          <w:p>
-            <w:r/>
-            <w:r>
-              <w:rPr>
-                <w:b w:val="0"/>
-                <w:sz w:val="17"/>
-              </w:rPr>
-              <w:t>OVOS_BRIDGE_HOST, OVOS_BRIDGE_PORT, OVOS_BRIDGE_TIMEOUT, OVOS external ports</w:t>
-            </w:r>
-          </w:p>
-        </w:tc>
-        <w:tc>
-          <w:tcPr>
-            <w:tcW w:type="dxa" w:w="3552"/>
-            <w:vAlign w:val="top"/>
-          </w:tcPr>
-          <w:p>
-            <w:r/>
-            <w:r>
-              <w:rPr>
-                <w:b w:val="0"/>
-                <w:sz w:val="17"/>
-              </w:rPr>
-              <w:t>.env.example; analytics/api/routes/ovos_voice.py; OVOS-EnMS repository compose</w:t>
-            </w:r>
-          </w:p>
-        </w:tc>
-      </w:tr>
-    </w:tbl>
-    <w:p/>
-    <w:p>
-      <w:pPr>
-        <w:pStyle w:val="Heading1"/>
-      </w:pPr>
-      <w:r>
-        <w:t>Step-By-Step Deployment</w:t>
-      </w:r>
-    </w:p>
     <w:p>
       <w:r>
-        <w:t>The guided setup path should be used for normal evaluation deployment. Manual commands are appropriate when operators have already prepared .env and want explicit control over build/start timing.</w:t>
+        <w:t>The environment table groups configuration by operational concern while avoiding private runtime values.</w:t>
       </w:r>
     </w:p>
     <w:tbl>
@@ -2807,7 +2431,7 @@
                 <w:b/>
                 <w:sz w:val="17"/>
               </w:rPr>
-              <w:t>Step</w:t>
+              <w:t>Group</w:t>
             </w:r>
           </w:p>
         </w:tc>
@@ -2824,7 +2448,7 @@
                 <w:b/>
                 <w:sz w:val="17"/>
               </w:rPr>
-              <w:t>Command / action</w:t>
+              <w:t>Representative variables</w:t>
             </w:r>
           </w:p>
         </w:tc>
@@ -2841,7 +2465,7 @@
                 <w:b/>
                 <w:sz w:val="17"/>
               </w:rPr>
-              <w:t>Expected result</w:t>
+              <w:t>Source basis</w:t>
             </w:r>
           </w:p>
         </w:tc>
@@ -2862,7 +2486,7 @@
                 <w:b w:val="0"/>
                 <w:sz w:val="17"/>
               </w:rPr>
-              <w:t>1. Review source</w:t>
+              <w:t>Database</w:t>
             </w:r>
           </w:p>
         </w:tc>
@@ -2878,7 +2502,7 @@
                 <w:b w:val="0"/>
                 <w:sz w:val="17"/>
               </w:rPr>
-              <w:t>Confirm current commit and inspect README.md, docker-compose.yml, .env.example.</w:t>
+              <w:t>POSTGRES_USER, POSTGRES_PASSWORD, POSTGRES_DB, POSTGRES_HOST, POSTGRES_PORT</w:t>
             </w:r>
           </w:p>
         </w:tc>
@@ -2894,7 +2518,7 @@
                 <w:b w:val="0"/>
                 <w:sz w:val="17"/>
               </w:rPr>
-              <w:t>Operator understands delivery scope and exposed services.</w:t>
+              <w:t>.env.example; docker-compose.yml; analytics/config.py</w:t>
             </w:r>
           </w:p>
         </w:tc>
@@ -2915,7 +2539,7 @@
                 <w:b w:val="0"/>
                 <w:sz w:val="17"/>
               </w:rPr>
-              <w:t>2. Prepare .env</w:t>
+              <w:t>Service ports</w:t>
             </w:r>
           </w:p>
         </w:tc>
@@ -2931,7 +2555,7 @@
                 <w:b w:val="0"/>
                 <w:sz w:val="17"/>
               </w:rPr>
-              <w:t>./setup.sh or copy .env.example to .env and replace placeholders.</w:t>
+              <w:t>NGINX_HTTP_PORT, ANALYTICS_PORT, SIMULATOR_PORT, GRAFANA_PORT, NODERED_PORT, RASA_PORT, CHATBOT_PORT, REDIS_EXTERNAL_PORT</w:t>
             </w:r>
           </w:p>
         </w:tc>
@@ -2947,7 +2571,7 @@
                 <w:b w:val="0"/>
                 <w:sz w:val="17"/>
               </w:rPr>
-              <w:t>Private runtime configuration exists locally and is not committed.</w:t>
+              <w:t>.env.example; docker-compose.yml</w:t>
             </w:r>
           </w:p>
         </w:tc>
@@ -2968,7 +2592,7 @@
                 <w:b w:val="0"/>
                 <w:sz w:val="17"/>
               </w:rPr>
-              <w:t>3. Validate Compose</w:t>
+              <w:t>Security and auth</w:t>
             </w:r>
           </w:p>
         </w:tc>
@@ -2984,7 +2608,7 @@
                 <w:b w:val="0"/>
                 <w:sz w:val="17"/>
               </w:rPr>
-              <w:t>docker compose config --quiet</w:t>
+              <w:t>JWT_SECRET, API_KEY, ADMIN_EMAILS, JWT expiration settings, Node-RED password hash/credential secret</w:t>
             </w:r>
           </w:p>
         </w:tc>
@@ -3000,7 +2624,7 @@
                 <w:b w:val="0"/>
                 <w:sz w:val="17"/>
               </w:rPr>
-              <w:t>Compose interpolation and syntax pass.</w:t>
+              <w:t>.env.example; auth-service/auth_service.py; nodered/settings.js</w:t>
             </w:r>
           </w:p>
         </w:tc>
@@ -3021,7 +2645,7 @@
                 <w:b w:val="0"/>
                 <w:sz w:val="17"/>
               </w:rPr>
-              <w:t>4. Build images</w:t>
+              <w:t>Telemetry</w:t>
             </w:r>
           </w:p>
         </w:tc>
@@ -3037,7 +2661,7 @@
                 <w:b w:val="0"/>
                 <w:sz w:val="17"/>
               </w:rPr>
-              <w:t>docker compose build</w:t>
+              <w:t>MQTT_HOST, MQTT_PORT, MQTT_USERNAME, MQTT_PASSWORD, simulator intervals and anomaly settings</w:t>
             </w:r>
           </w:p>
         </w:tc>
@@ -3053,7 +2677,7 @@
                 <w:b w:val="0"/>
                 <w:sz w:val="17"/>
               </w:rPr>
-              <w:t>Local service images are built.</w:t>
+              <w:t>.env.example; simulator/config.py</w:t>
             </w:r>
           </w:p>
         </w:tc>
@@ -3077,7 +2701,7 @@
                 <w:b w:val="0"/>
                 <w:sz w:val="17"/>
               </w:rPr>
-              <w:t>5. Start stack</w:t>
+              <w:t>Analytics behavior</w:t>
             </w:r>
           </w:p>
         </w:tc>
@@ -3096,7 +2720,7 @@
                 <w:b w:val="0"/>
                 <w:sz w:val="17"/>
               </w:rPr>
-              <w:t>docker compose up -d or setup.sh default start path.</w:t>
+              <w:t>LOG_LEVEL, scheduler settings, model storage, anomaly thresholds, cost/carbon defaults</w:t>
             </w:r>
           </w:p>
         </w:tc>
@@ -3115,7 +2739,7 @@
                 <w:b w:val="0"/>
                 <w:sz w:val="17"/>
               </w:rPr>
-              <w:t>Containers start on the configured network and volumes.</w:t>
+              <w:t>analytics/config.py; .env.example</w:t>
             </w:r>
           </w:p>
         </w:tc>
@@ -3136,7 +2760,7 @@
                 <w:b w:val="0"/>
                 <w:sz w:val="17"/>
               </w:rPr>
-              <w:t>6. Verify</w:t>
+              <w:t>OVOS proxy/runtime</w:t>
             </w:r>
           </w:p>
         </w:tc>
@@ -3152,7 +2776,7 @@
                 <w:b w:val="0"/>
                 <w:sz w:val="17"/>
               </w:rPr>
-              <w:t>docker compose ps, health endpoints, verify.sh when services are running.</w:t>
+              <w:t>OVOS_BRIDGE_HOST, OVOS_BRIDGE_PORT, OVOS_BRIDGE_TIMEOUT, OVOS external ports</w:t>
             </w:r>
           </w:p>
         </w:tc>
@@ -3168,24 +2792,34 @@
                 <w:b w:val="0"/>
                 <w:sz w:val="17"/>
               </w:rPr>
-              <w:t>Operator confirms live readiness before demo/handover.</w:t>
+              <w:t>.env.example; analytics/api/routes/ovos_voice.py; OVOS-EnMS repository compose</w:t>
             </w:r>
           </w:p>
         </w:tc>
       </w:tr>
     </w:tbl>
     <w:p/>
+    <w:p>
+      <w:r>
+        <w:t>The grouped variables make configuration review manageable while keeping sensitive deployed values out of stakeholder documentation.</w:t>
+      </w:r>
+    </w:p>
     <w:p>
       <w:pPr>
         <w:pStyle w:val="Heading1"/>
       </w:pPr>
       <w:r>
-        <w:t>Startup, Shutdown, And Clean Reinstall Procedures</w:t>
+        <w:t>Step-By-Step Deployment</w:t>
       </w:r>
     </w:p>
     <w:p>
       <w:r>
-        <w:t>Supported startup paths are ./setup.sh or manual Docker Compose commands after .env is prepared. Supported stop/start procedures use docker compose down/up or docker compose restart without deleting volumes. Destructive volume deletion is not part of routine operations.</w:t>
+        <w:t>The guided setup path should be used for normal evaluation deployment. Manual commands are appropriate when operators have already prepared .env and want explicit control over build/start timing.</w:t>
+      </w:r>
+    </w:p>
+    <w:p>
+      <w:r>
+        <w:t>The deployment table gives a controlled sequence for preparing, validating, building, starting, and verifying the stack.</w:t>
       </w:r>
     </w:p>
     <w:tbl>
@@ -3218,7 +2852,7 @@
                 <w:b/>
                 <w:sz w:val="17"/>
               </w:rPr>
-              <w:t>Procedure</w:t>
+              <w:t>Step</w:t>
             </w:r>
           </w:p>
         </w:tc>
@@ -3235,7 +2869,7 @@
                 <w:b/>
                 <w:sz w:val="17"/>
               </w:rPr>
-              <w:t>Command or source</w:t>
+              <w:t>Command / action</w:t>
             </w:r>
           </w:p>
         </w:tc>
@@ -3252,7 +2886,7 @@
                 <w:b/>
                 <w:sz w:val="17"/>
               </w:rPr>
-              <w:t>Notes</w:t>
+              <w:t>Expected result</w:t>
             </w:r>
           </w:p>
         </w:tc>
@@ -3273,7 +2907,7 @@
                 <w:b w:val="0"/>
                 <w:sz w:val="17"/>
               </w:rPr>
-              <w:t>Guided setup</w:t>
+              <w:t>1. Review source</w:t>
             </w:r>
           </w:p>
         </w:tc>
@@ -3289,7 +2923,7 @@
                 <w:b w:val="0"/>
                 <w:sz w:val="17"/>
               </w:rPr>
-              <w:t>./setup.sh [--server-ip HOST] [--no-build] [--no-start]</w:t>
+              <w:t>Confirm current commit and inspect README.md, docker-compose.yml, .env.example.</w:t>
             </w:r>
           </w:p>
         </w:tc>
@@ -3305,7 +2939,7 @@
                 <w:b w:val="0"/>
                 <w:sz w:val="17"/>
               </w:rPr>
-              <w:t>Creates/updates .env, validates compose, builds and starts by default.</w:t>
+              <w:t>Operator understands delivery scope and exposed services.</w:t>
             </w:r>
           </w:p>
         </w:tc>
@@ -3326,7 +2960,7 @@
                 <w:b w:val="0"/>
                 <w:sz w:val="17"/>
               </w:rPr>
-              <w:t>Manual validation</w:t>
+              <w:t>2. Prepare .env</w:t>
             </w:r>
           </w:p>
         </w:tc>
@@ -3342,7 +2976,7 @@
                 <w:b w:val="0"/>
                 <w:sz w:val="17"/>
               </w:rPr>
-              <w:t>docker compose config</w:t>
+              <w:t>./setup.sh or copy .env.example to .env and replace placeholders.</w:t>
             </w:r>
           </w:p>
         </w:tc>
@@ -3358,7 +2992,7 @@
                 <w:b w:val="0"/>
                 <w:sz w:val="17"/>
               </w:rPr>
-              <w:t>Base validation succeeded in this documentation pass.</w:t>
+              <w:t>Private runtime configuration exists locally and is not committed.</w:t>
             </w:r>
           </w:p>
         </w:tc>
@@ -3379,7 +3013,7 @@
                 <w:b w:val="0"/>
                 <w:sz w:val="17"/>
               </w:rPr>
-              <w:t>Manual start</w:t>
+              <w:t>3. Validate Compose</w:t>
             </w:r>
           </w:p>
         </w:tc>
@@ -3395,7 +3029,7 @@
                 <w:b w:val="0"/>
                 <w:sz w:val="17"/>
               </w:rPr>
-              <w:t>docker compose build; docker compose up -d</w:t>
+              <w:t>docker compose config --quiet</w:t>
             </w:r>
           </w:p>
         </w:tc>
@@ -3411,7 +3045,7 @@
                 <w:b w:val="0"/>
                 <w:sz w:val="17"/>
               </w:rPr>
-              <w:t>Use after .env has no placeholders.</w:t>
+              <w:t>Compose interpolation and syntax pass.</w:t>
             </w:r>
           </w:p>
         </w:tc>
@@ -3432,7 +3066,7 @@
                 <w:b w:val="0"/>
                 <w:sz w:val="17"/>
               </w:rPr>
-              <w:t>Restart service</w:t>
+              <w:t>4. Build images</w:t>
             </w:r>
           </w:p>
         </w:tc>
@@ -3448,7 +3082,7 @@
                 <w:b w:val="0"/>
                 <w:sz w:val="17"/>
               </w:rPr>
-              <w:t>docker compose restart analytics</w:t>
+              <w:t>docker compose build</w:t>
             </w:r>
           </w:p>
         </w:tc>
@@ -3464,7 +3098,7 @@
                 <w:b w:val="0"/>
                 <w:sz w:val="17"/>
               </w:rPr>
-              <w:t>Use service-specific logs to confirm recovery.</w:t>
+              <w:t>Local service images are built.</w:t>
             </w:r>
           </w:p>
         </w:tc>
@@ -3488,7 +3122,7 @@
                 <w:b w:val="0"/>
                 <w:sz w:val="17"/>
               </w:rPr>
-              <w:t>Stop without deleting data</w:t>
+              <w:t>5. Start stack</w:t>
             </w:r>
           </w:p>
         </w:tc>
@@ -3507,7 +3141,7 @@
                 <w:b w:val="0"/>
                 <w:sz w:val="17"/>
               </w:rPr>
-              <w:t>docker compose down</w:t>
+              <w:t>docker compose up -d or setup.sh default start path.</w:t>
             </w:r>
           </w:p>
         </w:tc>
@@ -3526,7 +3160,7 @@
                 <w:b w:val="0"/>
                 <w:sz w:val="17"/>
               </w:rPr>
-              <w:t>Keeps persistent volumes.</w:t>
+              <w:t>Containers start on the configured network and volumes.</w:t>
             </w:r>
           </w:p>
         </w:tc>
@@ -3547,7 +3181,7 @@
                 <w:b w:val="0"/>
                 <w:sz w:val="17"/>
               </w:rPr>
-              <w:t>Clean reinstall</w:t>
+              <w:t>6. Verify</w:t>
             </w:r>
           </w:p>
         </w:tc>
@@ -3563,7 +3197,7 @@
                 <w:b w:val="0"/>
                 <w:sz w:val="17"/>
               </w:rPr>
-              <w:t>Only when data removal is intended; do not use down -v casually</w:t>
+              <w:t>docker compose ps, health endpoints, verify.sh when services are running.</w:t>
             </w:r>
           </w:p>
         </w:tc>
@@ -3579,24 +3213,34 @@
                 <w:b w:val="0"/>
                 <w:sz w:val="17"/>
               </w:rPr>
-              <w:t>Back up data first.</w:t>
+              <w:t>Operator confirms live readiness before demo/handover.</w:t>
             </w:r>
           </w:p>
         </w:tc>
       </w:tr>
     </w:tbl>
     <w:p/>
+    <w:p>
+      <w:r>
+        <w:t>Following this sequence keeps installation reproducible and gives operators clear checkpoints before exposing the system to users.</w:t>
+      </w:r>
+    </w:p>
     <w:p>
       <w:pPr>
         <w:pStyle w:val="Heading1"/>
       </w:pPr>
       <w:r>
-        <w:t>Verification Scripts And Health Checks</w:t>
+        <w:t>Startup, Shutdown, And Clean Reinstall Procedures</w:t>
       </w:r>
     </w:p>
     <w:p>
       <w:r>
-        <w:t>The repository provides verification scripts. These scripts are source material for intended operational checks, but their success depends on a running stack and reachable services. In this documentation run, compose validation was executed; live health checks were not implied.</w:t>
+        <w:t>Supported startup paths are ./setup.sh or manual Docker Compose commands after .env is prepared. Supported stop/start procedures use docker compose down/up or docker compose restart without deleting volumes. Destructive volume deletion is not part of routine operations.</w:t>
+      </w:r>
+    </w:p>
+    <w:p>
+      <w:r>
+        <w:t>This procedure table separates routine operations from destructive reinstall actions.</w:t>
       </w:r>
     </w:p>
     <w:tbl>
@@ -3629,7 +3273,7 @@
                 <w:b/>
                 <w:sz w:val="17"/>
               </w:rPr>
-              <w:t>Check</w:t>
+              <w:t>Procedure</w:t>
             </w:r>
           </w:p>
         </w:tc>
@@ -3646,7 +3290,7 @@
                 <w:b/>
                 <w:sz w:val="17"/>
               </w:rPr>
-              <w:t>Purpose</w:t>
+              <w:t>Command or source</w:t>
             </w:r>
           </w:p>
         </w:tc>
@@ -3663,7 +3307,7 @@
                 <w:b/>
                 <w:sz w:val="17"/>
               </w:rPr>
-              <w:t>Source/status</w:t>
+              <w:t>Notes</w:t>
             </w:r>
           </w:p>
         </w:tc>
@@ -3684,7 +3328,7 @@
                 <w:b w:val="0"/>
                 <w:sz w:val="17"/>
               </w:rPr>
-              <w:t>docker compose config --quiet</w:t>
+              <w:t>Guided setup</w:t>
             </w:r>
           </w:p>
         </w:tc>
@@ -3700,7 +3344,7 @@
                 <w:b w:val="0"/>
                 <w:sz w:val="17"/>
               </w:rPr>
-              <w:t>Validate Compose syntax/resolution</w:t>
+              <w:t>./setup.sh [--server-ip HOST] [--no-build] [--no-start]</w:t>
             </w:r>
           </w:p>
         </w:tc>
@@ -3716,7 +3360,7 @@
                 <w:b w:val="0"/>
                 <w:sz w:val="17"/>
               </w:rPr>
-              <w:t>Ran successfully for base HumanEnerDIA stack.</w:t>
+              <w:t>Creates/updates .env, validates compose, builds and starts by default.</w:t>
             </w:r>
           </w:p>
         </w:tc>
@@ -3737,7 +3381,7 @@
                 <w:b w:val="0"/>
                 <w:sz w:val="17"/>
               </w:rPr>
-              <w:t>OVOS-EnMS repository docker-compose.yml</w:t>
+              <w:t>Manual validation</w:t>
             </w:r>
           </w:p>
         </w:tc>
@@ -3753,7 +3397,7 @@
                 <w:b w:val="0"/>
                 <w:sz w:val="17"/>
               </w:rPr>
-              <w:t>Validate OVOS assistant Compose configuration separately</w:t>
+              <w:t>docker compose config</w:t>
             </w:r>
           </w:p>
         </w:tc>
@@ -3769,7 +3413,7 @@
                 <w:b w:val="0"/>
                 <w:sz w:val="17"/>
               </w:rPr>
-              <w:t>Ran successfully during documentation review.</w:t>
+              <w:t>Base validation succeeded for the current delivery state.</w:t>
             </w:r>
           </w:p>
         </w:tc>
@@ -3790,7 +3434,7 @@
                 <w:b w:val="0"/>
                 <w:sz w:val="17"/>
               </w:rPr>
-              <w:t>verify.sh</w:t>
+              <w:t>Manual start</w:t>
             </w:r>
           </w:p>
         </w:tc>
@@ -3806,7 +3450,7 @@
                 <w:b w:val="0"/>
                 <w:sz w:val="17"/>
               </w:rPr>
-              <w:t>Checks Compose config and live Nginx, analytics, and optional OVOS endpoints when a stack is running</w:t>
+              <w:t>docker compose build; docker compose up -d</w:t>
             </w:r>
           </w:p>
         </w:tc>
@@ -3822,7 +3466,7 @@
                 <w:b w:val="0"/>
                 <w:sz w:val="17"/>
               </w:rPr>
-              <w:t>Script exists in production repository; live checks were not run in this pass.</w:t>
+              <w:t>Use after .env has no placeholders.</w:t>
             </w:r>
           </w:p>
         </w:tc>
@@ -3837,16 +3481,13 @@
             <w:vAlign w:val="top"/>
           </w:tcPr>
           <w:p>
-            <w:pPr>
-              <w:keepNext/>
-            </w:pPr>
             <w:r/>
             <w:r>
               <w:rPr>
                 <w:b w:val="0"/>
                 <w:sz w:val="17"/>
               </w:rPr>
-              <w:t>Chatbot/Rasa live checks</w:t>
+              <w:t>Restart service</w:t>
             </w:r>
           </w:p>
         </w:tc>
@@ -3856,16 +3497,13 @@
             <w:vAlign w:val="top"/>
           </w:tcPr>
           <w:p>
-            <w:pPr>
-              <w:keepNext/>
-            </w:pPr>
             <w:r/>
             <w:r>
               <w:rPr>
                 <w:b w:val="0"/>
                 <w:sz w:val="17"/>
               </w:rPr>
-              <w:t>Use Compose healthchecks, service logs, and chatbot/Rasa endpoints when services are running</w:t>
+              <w:t>docker compose restart analytics</w:t>
             </w:r>
           </w:p>
         </w:tc>
@@ -3875,16 +3513,13 @@
             <w:vAlign w:val="top"/>
           </w:tcPr>
           <w:p>
-            <w:pPr>
-              <w:keepNext/>
-            </w:pPr>
             <w:r/>
             <w:r>
               <w:rPr>
                 <w:b w:val="0"/>
                 <w:sz w:val="17"/>
               </w:rPr>
-              <w:t>No production-tracked standalone chatbot verification script is cited.</w:t>
+              <w:t>Use service-specific logs to confirm recovery.</w:t>
             </w:r>
           </w:p>
         </w:tc>
@@ -3899,13 +3534,16 @@
             <w:vAlign w:val="top"/>
           </w:tcPr>
           <w:p>
+            <w:pPr>
+              <w:keepNext/>
+            </w:pPr>
             <w:r/>
             <w:r>
               <w:rPr>
                 <w:b w:val="0"/>
                 <w:sz w:val="17"/>
               </w:rPr>
-              <w:t>Service healthchecks</w:t>
+              <w:t>Stop without deleting data</w:t>
             </w:r>
           </w:p>
         </w:tc>
@@ -3915,13 +3553,16 @@
             <w:vAlign w:val="top"/>
           </w:tcPr>
           <w:p>
+            <w:pPr>
+              <w:keepNext/>
+            </w:pPr>
             <w:r/>
             <w:r>
               <w:rPr>
                 <w:b w:val="0"/>
                 <w:sz w:val="17"/>
               </w:rPr>
-              <w:t>Container-level checks for all production Compose services</w:t>
+              <w:t>docker compose down</w:t>
             </w:r>
           </w:p>
         </w:tc>
@@ -3931,30 +3572,96 @@
             <w:vAlign w:val="top"/>
           </w:tcPr>
           <w:p>
+            <w:pPr>
+              <w:keepNext/>
+            </w:pPr>
             <w:r/>
             <w:r>
               <w:rPr>
                 <w:b w:val="0"/>
                 <w:sz w:val="17"/>
               </w:rPr>
-              <w:t>Configured in docker-compose.yml.</w:t>
+              <w:t>Keeps persistent volumes.</w:t>
+            </w:r>
+          </w:p>
+        </w:tc>
+      </w:tr>
+      <w:tr>
+        <w:trPr>
+          <w:cantSplit/>
+        </w:trPr>
+        <w:tc>
+          <w:tcPr>
+            <w:tcW w:type="dxa" w:w="3552"/>
+            <w:vAlign w:val="top"/>
+          </w:tcPr>
+          <w:p>
+            <w:r/>
+            <w:r>
+              <w:rPr>
+                <w:b w:val="0"/>
+                <w:sz w:val="17"/>
+              </w:rPr>
+              <w:t>Clean reinstall</w:t>
+            </w:r>
+          </w:p>
+        </w:tc>
+        <w:tc>
+          <w:tcPr>
+            <w:tcW w:type="dxa" w:w="3552"/>
+            <w:vAlign w:val="top"/>
+          </w:tcPr>
+          <w:p>
+            <w:r/>
+            <w:r>
+              <w:rPr>
+                <w:b w:val="0"/>
+                <w:sz w:val="17"/>
+              </w:rPr>
+              <w:t>Only when data removal is intended; do not use down -v casually</w:t>
+            </w:r>
+          </w:p>
+        </w:tc>
+        <w:tc>
+          <w:tcPr>
+            <w:tcW w:type="dxa" w:w="3552"/>
+            <w:vAlign w:val="top"/>
+          </w:tcPr>
+          <w:p>
+            <w:r/>
+            <w:r>
+              <w:rPr>
+                <w:b w:val="0"/>
+                <w:sz w:val="17"/>
+              </w:rPr>
+              <w:t>Back up data first.</w:t>
             </w:r>
           </w:p>
         </w:tc>
       </w:tr>
     </w:tbl>
     <w:p/>
+    <w:p>
+      <w:r>
+        <w:t>The procedure split protects persistent data. Routine restarts should preserve volumes, while clean reinstalls require deliberate data-removal decisions.</w:t>
+      </w:r>
+    </w:p>
     <w:p>
       <w:pPr>
         <w:pStyle w:val="Heading1"/>
       </w:pPr>
       <w:r>
-        <w:t>Healthcheck Details</w:t>
+        <w:t>Verification Scripts And Health Checks</w:t>
       </w:r>
     </w:p>
     <w:p>
       <w:r>
-        <w:t>Compose healthchecks are present for the production service inventory. A healthy container does not prove business data quality, but it is the first operational signal for deployment readiness.</w:t>
+        <w:t>The repository provides verification scripts. These scripts are source material for intended operational checks, but their success depends on a running stack and reachable services. In this documentation run, compose validation was executed; live health checks were not implied.</w:t>
+      </w:r>
+    </w:p>
+    <w:p>
+      <w:r>
+        <w:t>The verification table clarifies which checks are static validation and which require live services.</w:t>
       </w:r>
     </w:p>
     <w:tbl>
@@ -3987,7 +3694,7 @@
                 <w:b/>
                 <w:sz w:val="17"/>
               </w:rPr>
-              <w:t>Service</w:t>
+              <w:t>Check</w:t>
             </w:r>
           </w:p>
         </w:tc>
@@ -4004,7 +3711,7 @@
                 <w:b/>
                 <w:sz w:val="17"/>
               </w:rPr>
-              <w:t>Healthcheck focus</w:t>
+              <w:t>Purpose</w:t>
             </w:r>
           </w:p>
         </w:tc>
@@ -4021,7 +3728,7 @@
                 <w:b/>
                 <w:sz w:val="17"/>
               </w:rPr>
-              <w:t>Interpretation</w:t>
+              <w:t>Source/status</w:t>
             </w:r>
           </w:p>
         </w:tc>
@@ -4042,7 +3749,7 @@
                 <w:b w:val="0"/>
                 <w:sz w:val="17"/>
               </w:rPr>
-              <w:t>nginx</w:t>
+              <w:t>docker compose config --quiet</w:t>
             </w:r>
           </w:p>
         </w:tc>
@@ -4058,7 +3765,7 @@
                 <w:b w:val="0"/>
                 <w:sz w:val="17"/>
               </w:rPr>
-              <w:t>wget/curl style check to /health</w:t>
+              <w:t>Validate Compose syntax/resolution</w:t>
             </w:r>
           </w:p>
         </w:tc>
@@ -4074,7 +3781,7 @@
                 <w:b w:val="0"/>
                 <w:sz w:val="17"/>
               </w:rPr>
-              <w:t>Confirms gateway process responds, not full upstream health.</w:t>
+              <w:t>Ran successfully for base HumanEnerDIA stack.</w:t>
             </w:r>
           </w:p>
         </w:tc>
@@ -4095,7 +3802,7 @@
                 <w:b w:val="0"/>
                 <w:sz w:val="17"/>
               </w:rPr>
-              <w:t>postgres</w:t>
+              <w:t>OVOS-EnMS repository docker-compose.yml</w:t>
             </w:r>
           </w:p>
         </w:tc>
@@ -4111,7 +3818,7 @@
                 <w:b w:val="0"/>
                 <w:sz w:val="17"/>
               </w:rPr>
-              <w:t>pg_isready</w:t>
+              <w:t>Validate OVOS assistant Compose configuration separately</w:t>
             </w:r>
           </w:p>
         </w:tc>
@@ -4127,7 +3834,7 @@
                 <w:b w:val="0"/>
                 <w:sz w:val="17"/>
               </w:rPr>
-              <w:t>Confirms database accepts connections.</w:t>
+              <w:t>Ran successfully during documentation review.</w:t>
             </w:r>
           </w:p>
         </w:tc>
@@ -4148,7 +3855,7 @@
                 <w:b w:val="0"/>
                 <w:sz w:val="17"/>
               </w:rPr>
-              <w:t>mqtt</w:t>
+              <w:t>verify.sh</w:t>
             </w:r>
           </w:p>
         </w:tc>
@@ -4164,7 +3871,7 @@
                 <w:b w:val="0"/>
                 <w:sz w:val="17"/>
               </w:rPr>
-              <w:t>mosquitto_pub/sub or broker health command</w:t>
+              <w:t>Checks Compose config and live Nginx, analytics, and optional OVOS endpoints when a stack is running</w:t>
             </w:r>
           </w:p>
         </w:tc>
@@ -4180,7 +3887,7 @@
                 <w:b w:val="0"/>
                 <w:sz w:val="17"/>
               </w:rPr>
-              <w:t>Confirms broker is reachable with configured credentials.</w:t>
+              <w:t>Script exists in the production repository; live checks require a running target deployment.</w:t>
             </w:r>
           </w:p>
         </w:tc>
@@ -4195,13 +3902,16 @@
             <w:vAlign w:val="top"/>
           </w:tcPr>
           <w:p>
+            <w:pPr>
+              <w:keepNext/>
+            </w:pPr>
             <w:r/>
             <w:r>
               <w:rPr>
                 <w:b w:val="0"/>
                 <w:sz w:val="17"/>
               </w:rPr>
-              <w:t>redis</w:t>
+              <w:t>Chatbot/Rasa live checks</w:t>
             </w:r>
           </w:p>
         </w:tc>
@@ -4211,13 +3921,16 @@
             <w:vAlign w:val="top"/>
           </w:tcPr>
           <w:p>
+            <w:pPr>
+              <w:keepNext/>
+            </w:pPr>
             <w:r/>
             <w:r>
               <w:rPr>
                 <w:b w:val="0"/>
                 <w:sz w:val="17"/>
               </w:rPr>
-              <w:t>redis-cli ping with password</w:t>
+              <w:t>Use Compose healthchecks, service logs, and chatbot/Rasa endpoints when services are running</w:t>
             </w:r>
           </w:p>
         </w:tc>
@@ -4227,13 +3940,16 @@
             <w:vAlign w:val="top"/>
           </w:tcPr>
           <w:p>
+            <w:pPr>
+              <w:keepNext/>
+            </w:pPr>
             <w:r/>
             <w:r>
               <w:rPr>
                 <w:b w:val="0"/>
                 <w:sz w:val="17"/>
               </w:rPr>
-              <w:t>Confirms Redis responds.</w:t>
+              <w:t>No production-tracked standalone chatbot verification script is cited.</w:t>
             </w:r>
           </w:p>
         </w:tc>
@@ -4254,7 +3970,7 @@
                 <w:b w:val="0"/>
                 <w:sz w:val="17"/>
               </w:rPr>
-              <w:t>simulator</w:t>
+              <w:t>Service healthchecks</w:t>
             </w:r>
           </w:p>
         </w:tc>
@@ -4270,7 +3986,7 @@
                 <w:b w:val="0"/>
                 <w:sz w:val="17"/>
               </w:rPr>
-              <w:t>HTTP /health</w:t>
+              <w:t>Container-level checks for all production Compose services</w:t>
             </w:r>
           </w:p>
         </w:tc>
@@ -4286,298 +4002,34 @@
                 <w:b w:val="0"/>
                 <w:sz w:val="17"/>
               </w:rPr>
-              <w:t>Confirms simulator API process health.</w:t>
-            </w:r>
-          </w:p>
-        </w:tc>
-      </w:tr>
-      <w:tr>
-        <w:trPr>
-          <w:cantSplit/>
-        </w:trPr>
-        <w:tc>
-          <w:tcPr>
-            <w:tcW w:type="dxa" w:w="3552"/>
-            <w:vAlign w:val="top"/>
-          </w:tcPr>
-          <w:p>
-            <w:r/>
-            <w:r>
-              <w:rPr>
-                <w:b w:val="0"/>
-                <w:sz w:val="17"/>
-              </w:rPr>
-              <w:t>nodered</w:t>
-            </w:r>
-          </w:p>
-        </w:tc>
-        <w:tc>
-          <w:tcPr>
-            <w:tcW w:type="dxa" w:w="3552"/>
-            <w:vAlign w:val="top"/>
-          </w:tcPr>
-          <w:p>
-            <w:r/>
-            <w:r>
-              <w:rPr>
-                <w:b w:val="0"/>
-                <w:sz w:val="17"/>
-              </w:rPr>
-              <w:t>HTTP admin/API health check</w:t>
-            </w:r>
-          </w:p>
-        </w:tc>
-        <w:tc>
-          <w:tcPr>
-            <w:tcW w:type="dxa" w:w="3552"/>
-            <w:vAlign w:val="top"/>
-          </w:tcPr>
-          <w:p>
-            <w:r/>
-            <w:r>
-              <w:rPr>
-                <w:b w:val="0"/>
-                <w:sz w:val="17"/>
-              </w:rPr>
-              <w:t>Confirms Node-RED runtime responds.</w:t>
-            </w:r>
-          </w:p>
-        </w:tc>
-      </w:tr>
-      <w:tr>
-        <w:trPr>
-          <w:cantSplit/>
-        </w:trPr>
-        <w:tc>
-          <w:tcPr>
-            <w:tcW w:type="dxa" w:w="3552"/>
-            <w:vAlign w:val="top"/>
-          </w:tcPr>
-          <w:p>
-            <w:r/>
-            <w:r>
-              <w:rPr>
-                <w:b w:val="0"/>
-                <w:sz w:val="17"/>
-              </w:rPr>
-              <w:t>grafana</w:t>
-            </w:r>
-          </w:p>
-        </w:tc>
-        <w:tc>
-          <w:tcPr>
-            <w:tcW w:type="dxa" w:w="3552"/>
-            <w:vAlign w:val="top"/>
-          </w:tcPr>
-          <w:p>
-            <w:r/>
-            <w:r>
-              <w:rPr>
-                <w:b w:val="0"/>
-                <w:sz w:val="17"/>
-              </w:rPr>
-              <w:t>HTTP /api/health</w:t>
-            </w:r>
-          </w:p>
-        </w:tc>
-        <w:tc>
-          <w:tcPr>
-            <w:tcW w:type="dxa" w:w="3552"/>
-            <w:vAlign w:val="top"/>
-          </w:tcPr>
-          <w:p>
-            <w:r/>
-            <w:r>
-              <w:rPr>
-                <w:b w:val="0"/>
-                <w:sz w:val="17"/>
-              </w:rPr>
-              <w:t>Confirms Grafana process health.</w:t>
-            </w:r>
-          </w:p>
-        </w:tc>
-      </w:tr>
-      <w:tr>
-        <w:trPr>
-          <w:cantSplit/>
-        </w:trPr>
-        <w:tc>
-          <w:tcPr>
-            <w:tcW w:type="dxa" w:w="3552"/>
-            <w:vAlign w:val="top"/>
-          </w:tcPr>
-          <w:p>
-            <w:r/>
-            <w:r>
-              <w:rPr>
-                <w:b w:val="0"/>
-                <w:sz w:val="17"/>
-              </w:rPr>
-              <w:t>analytics</w:t>
-            </w:r>
-          </w:p>
-        </w:tc>
-        <w:tc>
-          <w:tcPr>
-            <w:tcW w:type="dxa" w:w="3552"/>
-            <w:vAlign w:val="top"/>
-          </w:tcPr>
-          <w:p>
-            <w:r/>
-            <w:r>
-              <w:rPr>
-                <w:b w:val="0"/>
-                <w:sz w:val="17"/>
-              </w:rPr>
-              <w:t>HTTP /api/v1/health</w:t>
-            </w:r>
-          </w:p>
-        </w:tc>
-        <w:tc>
-          <w:tcPr>
-            <w:tcW w:type="dxa" w:w="3552"/>
-            <w:vAlign w:val="top"/>
-          </w:tcPr>
-          <w:p>
-            <w:r/>
-            <w:r>
-              <w:rPr>
-                <w:b w:val="0"/>
-                <w:sz w:val="17"/>
-              </w:rPr>
-              <w:t>Confirms analytics service and database checks exposed by route.</w:t>
-            </w:r>
-          </w:p>
-        </w:tc>
-      </w:tr>
-      <w:tr>
-        <w:trPr>
-          <w:cantSplit/>
-        </w:trPr>
-        <w:tc>
-          <w:tcPr>
-            <w:tcW w:type="dxa" w:w="3552"/>
-            <w:vAlign w:val="top"/>
-          </w:tcPr>
-          <w:p>
-            <w:pPr>
-              <w:keepNext/>
-            </w:pPr>
-            <w:r/>
-            <w:r>
-              <w:rPr>
-                <w:b w:val="0"/>
-                <w:sz w:val="17"/>
-              </w:rPr>
-              <w:t>auth-service</w:t>
-            </w:r>
-          </w:p>
-        </w:tc>
-        <w:tc>
-          <w:tcPr>
-            <w:tcW w:type="dxa" w:w="3552"/>
-            <w:vAlign w:val="top"/>
-          </w:tcPr>
-          <w:p>
-            <w:pPr>
-              <w:keepNext/>
-            </w:pPr>
-            <w:r/>
-            <w:r>
-              <w:rPr>
-                <w:b w:val="0"/>
-                <w:sz w:val="17"/>
-              </w:rPr>
-              <w:t>HTTP /api/auth/health</w:t>
-            </w:r>
-          </w:p>
-        </w:tc>
-        <w:tc>
-          <w:tcPr>
-            <w:tcW w:type="dxa" w:w="3552"/>
-            <w:vAlign w:val="top"/>
-          </w:tcPr>
-          <w:p>
-            <w:pPr>
-              <w:keepNext/>
-            </w:pPr>
-            <w:r/>
-            <w:r>
-              <w:rPr>
-                <w:b w:val="0"/>
-                <w:sz w:val="17"/>
-              </w:rPr>
-              <w:t>Confirms Flask auth service responds.</w:t>
-            </w:r>
-          </w:p>
-        </w:tc>
-      </w:tr>
-      <w:tr>
-        <w:trPr>
-          <w:cantSplit/>
-        </w:trPr>
-        <w:tc>
-          <w:tcPr>
-            <w:tcW w:type="dxa" w:w="3552"/>
-            <w:vAlign w:val="top"/>
-          </w:tcPr>
-          <w:p>
-            <w:r/>
-            <w:r>
-              <w:rPr>
-                <w:b w:val="0"/>
-                <w:sz w:val="17"/>
-              </w:rPr>
-              <w:t>rasa/rasa-actions/chatbot</w:t>
-            </w:r>
-          </w:p>
-        </w:tc>
-        <w:tc>
-          <w:tcPr>
-            <w:tcW w:type="dxa" w:w="3552"/>
-            <w:vAlign w:val="top"/>
-          </w:tcPr>
-          <w:p>
-            <w:r/>
-            <w:r>
-              <w:rPr>
-                <w:b w:val="0"/>
-                <w:sz w:val="17"/>
-              </w:rPr>
-              <w:t>HTTP health or root checks from Compose healthcheck</w:t>
-            </w:r>
-          </w:p>
-        </w:tc>
-        <w:tc>
-          <w:tcPr>
-            <w:tcW w:type="dxa" w:w="3552"/>
-            <w:vAlign w:val="top"/>
-          </w:tcPr>
-          <w:p>
-            <w:r/>
-            <w:r>
-              <w:rPr>
-                <w:b w:val="0"/>
-                <w:sz w:val="17"/>
-              </w:rPr>
-              <w:t>Confirms chatbot components respond.</w:t>
+              <w:t>Configured in docker-compose.yml.</w:t>
             </w:r>
           </w:p>
         </w:tc>
       </w:tr>
     </w:tbl>
     <w:p/>
+    <w:p>
+      <w:r>
+        <w:t>The verification model separates configuration validity from live service readiness. Both are needed for a credible deployment handover.</w:t>
+      </w:r>
+    </w:p>
     <w:p>
       <w:pPr>
         <w:pStyle w:val="Heading1"/>
       </w:pPr>
       <w:r>
-        <w:t>Backup And Recovery</w:t>
+        <w:t>Healthcheck Details</w:t>
       </w:r>
     </w:p>
     <w:p>
       <w:r>
-        <w:t>The production tree provides persistent volumes and tracked dashboard/flow configuration, but it does not provide a complete universal backup/restore automation. Operators should implement tested backup procedures before production data is at risk.</w:t>
+        <w:t>Compose healthchecks are present for the production service inventory. A healthy container does not prove business data quality, but it is the first operational signal for deployment readiness.</w:t>
+      </w:r>
+    </w:p>
+    <w:p>
+      <w:r>
+        <w:t>The healthcheck table explains what each container health signal proves and what it does not prove.</w:t>
       </w:r>
     </w:p>
     <w:tbl>
@@ -4610,7 +4062,7 @@
                 <w:b/>
                 <w:sz w:val="17"/>
               </w:rPr>
-              <w:t>Area</w:t>
+              <w:t>Service</w:t>
             </w:r>
           </w:p>
         </w:tc>
@@ -4627,7 +4079,7 @@
                 <w:b/>
                 <w:sz w:val="17"/>
               </w:rPr>
-              <w:t>Recommended handling</w:t>
+              <w:t>Healthcheck focus</w:t>
             </w:r>
           </w:p>
         </w:tc>
@@ -4644,7 +4096,7 @@
                 <w:b/>
                 <w:sz w:val="17"/>
               </w:rPr>
-              <w:t>Caution</w:t>
+              <w:t>Interpretation</w:t>
             </w:r>
           </w:p>
         </w:tc>
@@ -4665,7 +4117,7 @@
                 <w:b w:val="0"/>
                 <w:sz w:val="17"/>
               </w:rPr>
-              <w:t>PostgreSQL/TimescaleDB</w:t>
+              <w:t>nginx</w:t>
             </w:r>
           </w:p>
         </w:tc>
@@ -4681,7 +4133,7 @@
                 <w:b w:val="0"/>
                 <w:sz w:val="17"/>
               </w:rPr>
-              <w:t>Use pg_dump/pg_restore or platform database backups before upgrades and before docker compose down -v.</w:t>
+              <w:t>wget/curl style check to /health</w:t>
             </w:r>
           </w:p>
         </w:tc>
@@ -4697,7 +4149,7 @@
                 <w:b w:val="0"/>
                 <w:sz w:val="17"/>
               </w:rPr>
-              <w:t>No tracked generic database backup script exists in production.</w:t>
+              <w:t>Confirms gateway process responds, not full upstream health.</w:t>
             </w:r>
           </w:p>
         </w:tc>
@@ -4718,7 +4170,7 @@
                 <w:b w:val="0"/>
                 <w:sz w:val="17"/>
               </w:rPr>
-              <w:t>Grafana dashboards</w:t>
+              <w:t>postgres</w:t>
             </w:r>
           </w:p>
         </w:tc>
@@ -4734,7 +4186,7 @@
                 <w:b w:val="0"/>
                 <w:sz w:val="17"/>
               </w:rPr>
-              <w:t>Keep intended dashboard JSON under grafana/dashboards and provisioning under grafana/provisioning.</w:t>
+              <w:t>pg_isready</w:t>
             </w:r>
           </w:p>
         </w:tc>
@@ -4750,7 +4202,7 @@
                 <w:b w:val="0"/>
                 <w:sz w:val="17"/>
               </w:rPr>
-              <w:t>Back up runtime edits before replacing Grafana volumes.</w:t>
+              <w:t>Confirms database accepts connections.</w:t>
             </w:r>
           </w:p>
         </w:tc>
@@ -4771,7 +4223,7 @@
                 <w:b w:val="0"/>
                 <w:sz w:val="17"/>
               </w:rPr>
-              <w:t>Node-RED flows</w:t>
+              <w:t>mqtt</w:t>
             </w:r>
           </w:p>
         </w:tc>
@@ -4787,7 +4239,7 @@
                 <w:b w:val="0"/>
                 <w:sz w:val="17"/>
               </w:rPr>
-              <w:t>nodered/data/flows.json is tracked; credential-bearing runtime files should not be published.</w:t>
+              <w:t>mosquitto_pub/sub or broker health command</w:t>
             </w:r>
           </w:p>
         </w:tc>
@@ -4803,7 +4255,7 @@
                 <w:b w:val="0"/>
                 <w:sz w:val="17"/>
               </w:rPr>
-              <w:t>Credential files are excluded from documentation.</w:t>
+              <w:t>Confirms broker is reachable with configured credentials.</w:t>
             </w:r>
           </w:p>
         </w:tc>
@@ -4818,16 +4270,13 @@
             <w:vAlign w:val="top"/>
           </w:tcPr>
           <w:p>
-            <w:pPr>
-              <w:keepNext/>
-            </w:pPr>
             <w:r/>
             <w:r>
               <w:rPr>
                 <w:b w:val="0"/>
                 <w:sz w:val="17"/>
               </w:rPr>
-              <w:t>Docker volumes</w:t>
+              <w:t>redis</w:t>
             </w:r>
           </w:p>
         </w:tc>
@@ -4837,16 +4286,13 @@
             <w:vAlign w:val="top"/>
           </w:tcPr>
           <w:p>
-            <w:pPr>
-              <w:keepNext/>
-            </w:pPr>
             <w:r/>
             <w:r>
               <w:rPr>
                 <w:b w:val="0"/>
                 <w:sz w:val="17"/>
               </w:rPr>
-              <w:t>postgres-data, grafana-data, mqtt data/logs, redis-data, Node-RED data</w:t>
+              <w:t>redis-cli ping with password</w:t>
             </w:r>
           </w:p>
         </w:tc>
@@ -4856,16 +4302,13 @@
             <w:vAlign w:val="top"/>
           </w:tcPr>
           <w:p>
-            <w:pPr>
-              <w:keepNext/>
-            </w:pPr>
             <w:r/>
             <w:r>
               <w:rPr>
                 <w:b w:val="0"/>
                 <w:sz w:val="17"/>
               </w:rPr>
-              <w:t>Volume deletion is destructive.</w:t>
+              <w:t>Confirms Redis responds.</w:t>
             </w:r>
           </w:p>
         </w:tc>
@@ -4886,7 +4329,7 @@
                 <w:b w:val="0"/>
                 <w:sz w:val="17"/>
               </w:rPr>
-              <w:t>Documentation package</w:t>
+              <w:t>simulator</w:t>
             </w:r>
           </w:p>
         </w:tc>
@@ -4902,7 +4345,7 @@
                 <w:b w:val="0"/>
                 <w:sz w:val="17"/>
               </w:rPr>
-              <w:t>Regenerate DOCX from docs/final-delivery/source/generate_delivery_docs.py and source Markdown/assets.</w:t>
+              <w:t>HTTP /health</w:t>
             </w:r>
           </w:p>
         </w:tc>
@@ -4918,281 +4361,308 @@
                 <w:b w:val="0"/>
                 <w:sz w:val="17"/>
               </w:rPr>
-              <w:t>Keeps source and deliverables reproducible.</w:t>
+              <w:t>Confirms simulator API process health.</w:t>
+            </w:r>
+          </w:p>
+        </w:tc>
+      </w:tr>
+      <w:tr>
+        <w:trPr>
+          <w:cantSplit/>
+        </w:trPr>
+        <w:tc>
+          <w:tcPr>
+            <w:tcW w:type="dxa" w:w="3552"/>
+            <w:vAlign w:val="top"/>
+          </w:tcPr>
+          <w:p>
+            <w:r/>
+            <w:r>
+              <w:rPr>
+                <w:b w:val="0"/>
+                <w:sz w:val="17"/>
+              </w:rPr>
+              <w:t>nodered</w:t>
+            </w:r>
+          </w:p>
+        </w:tc>
+        <w:tc>
+          <w:tcPr>
+            <w:tcW w:type="dxa" w:w="3552"/>
+            <w:vAlign w:val="top"/>
+          </w:tcPr>
+          <w:p>
+            <w:r/>
+            <w:r>
+              <w:rPr>
+                <w:b w:val="0"/>
+                <w:sz w:val="17"/>
+              </w:rPr>
+              <w:t>HTTP admin/API health check</w:t>
+            </w:r>
+          </w:p>
+        </w:tc>
+        <w:tc>
+          <w:tcPr>
+            <w:tcW w:type="dxa" w:w="3552"/>
+            <w:vAlign w:val="top"/>
+          </w:tcPr>
+          <w:p>
+            <w:r/>
+            <w:r>
+              <w:rPr>
+                <w:b w:val="0"/>
+                <w:sz w:val="17"/>
+              </w:rPr>
+              <w:t>Confirms Node-RED runtime responds.</w:t>
+            </w:r>
+          </w:p>
+        </w:tc>
+      </w:tr>
+      <w:tr>
+        <w:trPr>
+          <w:cantSplit/>
+        </w:trPr>
+        <w:tc>
+          <w:tcPr>
+            <w:tcW w:type="dxa" w:w="3552"/>
+            <w:vAlign w:val="top"/>
+          </w:tcPr>
+          <w:p>
+            <w:r/>
+            <w:r>
+              <w:rPr>
+                <w:b w:val="0"/>
+                <w:sz w:val="17"/>
+              </w:rPr>
+              <w:t>grafana</w:t>
+            </w:r>
+          </w:p>
+        </w:tc>
+        <w:tc>
+          <w:tcPr>
+            <w:tcW w:type="dxa" w:w="3552"/>
+            <w:vAlign w:val="top"/>
+          </w:tcPr>
+          <w:p>
+            <w:r/>
+            <w:r>
+              <w:rPr>
+                <w:b w:val="0"/>
+                <w:sz w:val="17"/>
+              </w:rPr>
+              <w:t>HTTP /api/health</w:t>
+            </w:r>
+          </w:p>
+        </w:tc>
+        <w:tc>
+          <w:tcPr>
+            <w:tcW w:type="dxa" w:w="3552"/>
+            <w:vAlign w:val="top"/>
+          </w:tcPr>
+          <w:p>
+            <w:r/>
+            <w:r>
+              <w:rPr>
+                <w:b w:val="0"/>
+                <w:sz w:val="17"/>
+              </w:rPr>
+              <w:t>Confirms Grafana process health.</w:t>
+            </w:r>
+          </w:p>
+        </w:tc>
+      </w:tr>
+      <w:tr>
+        <w:trPr>
+          <w:cantSplit/>
+        </w:trPr>
+        <w:tc>
+          <w:tcPr>
+            <w:tcW w:type="dxa" w:w="3552"/>
+            <w:vAlign w:val="top"/>
+          </w:tcPr>
+          <w:p>
+            <w:r/>
+            <w:r>
+              <w:rPr>
+                <w:b w:val="0"/>
+                <w:sz w:val="17"/>
+              </w:rPr>
+              <w:t>analytics</w:t>
+            </w:r>
+          </w:p>
+        </w:tc>
+        <w:tc>
+          <w:tcPr>
+            <w:tcW w:type="dxa" w:w="3552"/>
+            <w:vAlign w:val="top"/>
+          </w:tcPr>
+          <w:p>
+            <w:r/>
+            <w:r>
+              <w:rPr>
+                <w:b w:val="0"/>
+                <w:sz w:val="17"/>
+              </w:rPr>
+              <w:t>HTTP /api/v1/health</w:t>
+            </w:r>
+          </w:p>
+        </w:tc>
+        <w:tc>
+          <w:tcPr>
+            <w:tcW w:type="dxa" w:w="3552"/>
+            <w:vAlign w:val="top"/>
+          </w:tcPr>
+          <w:p>
+            <w:r/>
+            <w:r>
+              <w:rPr>
+                <w:b w:val="0"/>
+                <w:sz w:val="17"/>
+              </w:rPr>
+              <w:t>Confirms analytics service and database checks exposed by route.</w:t>
+            </w:r>
+          </w:p>
+        </w:tc>
+      </w:tr>
+      <w:tr>
+        <w:trPr>
+          <w:cantSplit/>
+        </w:trPr>
+        <w:tc>
+          <w:tcPr>
+            <w:tcW w:type="dxa" w:w="3552"/>
+            <w:vAlign w:val="top"/>
+          </w:tcPr>
+          <w:p>
+            <w:pPr>
+              <w:keepNext/>
+            </w:pPr>
+            <w:r/>
+            <w:r>
+              <w:rPr>
+                <w:b w:val="0"/>
+                <w:sz w:val="17"/>
+              </w:rPr>
+              <w:t>auth-service</w:t>
+            </w:r>
+          </w:p>
+        </w:tc>
+        <w:tc>
+          <w:tcPr>
+            <w:tcW w:type="dxa" w:w="3552"/>
+            <w:vAlign w:val="top"/>
+          </w:tcPr>
+          <w:p>
+            <w:pPr>
+              <w:keepNext/>
+            </w:pPr>
+            <w:r/>
+            <w:r>
+              <w:rPr>
+                <w:b w:val="0"/>
+                <w:sz w:val="17"/>
+              </w:rPr>
+              <w:t>HTTP /api/auth/health</w:t>
+            </w:r>
+          </w:p>
+        </w:tc>
+        <w:tc>
+          <w:tcPr>
+            <w:tcW w:type="dxa" w:w="3552"/>
+            <w:vAlign w:val="top"/>
+          </w:tcPr>
+          <w:p>
+            <w:pPr>
+              <w:keepNext/>
+            </w:pPr>
+            <w:r/>
+            <w:r>
+              <w:rPr>
+                <w:b w:val="0"/>
+                <w:sz w:val="17"/>
+              </w:rPr>
+              <w:t>Confirms Flask auth service responds.</w:t>
+            </w:r>
+          </w:p>
+        </w:tc>
+      </w:tr>
+      <w:tr>
+        <w:trPr>
+          <w:cantSplit/>
+        </w:trPr>
+        <w:tc>
+          <w:tcPr>
+            <w:tcW w:type="dxa" w:w="3552"/>
+            <w:vAlign w:val="top"/>
+          </w:tcPr>
+          <w:p>
+            <w:r/>
+            <w:r>
+              <w:rPr>
+                <w:b w:val="0"/>
+                <w:sz w:val="17"/>
+              </w:rPr>
+              <w:t>rasa/rasa-actions/chatbot</w:t>
+            </w:r>
+          </w:p>
+        </w:tc>
+        <w:tc>
+          <w:tcPr>
+            <w:tcW w:type="dxa" w:w="3552"/>
+            <w:vAlign w:val="top"/>
+          </w:tcPr>
+          <w:p>
+            <w:r/>
+            <w:r>
+              <w:rPr>
+                <w:b w:val="0"/>
+                <w:sz w:val="17"/>
+              </w:rPr>
+              <w:t>HTTP health or root checks from Compose healthcheck</w:t>
+            </w:r>
+          </w:p>
+        </w:tc>
+        <w:tc>
+          <w:tcPr>
+            <w:tcW w:type="dxa" w:w="3552"/>
+            <w:vAlign w:val="top"/>
+          </w:tcPr>
+          <w:p>
+            <w:r/>
+            <w:r>
+              <w:rPr>
+                <w:b w:val="0"/>
+                <w:sz w:val="17"/>
+              </w:rPr>
+              <w:t>Confirms chatbot components respond.</w:t>
             </w:r>
           </w:p>
         </w:tc>
       </w:tr>
     </w:tbl>
     <w:p/>
+    <w:p>
+      <w:r>
+        <w:t>Healthchecks are early indicators, not full business validation. They should be combined with data freshness, dashboard, API, and workflow checks.</w:t>
+      </w:r>
+    </w:p>
     <w:p>
       <w:pPr>
         <w:pStyle w:val="Heading1"/>
       </w:pPr>
       <w:r>
-        <w:t>Upgrade And Redeployment</w:t>
+        <w:t>Backup And Recovery</w:t>
       </w:r>
     </w:p>
     <w:p>
       <w:r>
-        <w:t>Redeployment should be treated as a controlled change. Take backups, rebuild images, restart services, and run smoke checks. If schema/data changes are introduced in future versions, rollback must include database/volume strategy, not only Git checkout.</w:t>
-      </w:r>
-    </w:p>
-    <w:tbl>
-      <w:tblPr>
-        <w:tblStyle w:val="TableGrid"/>
-        <w:tblW w:type="auto" w:w="0"/>
-        <w:jc w:val="center"/>
-        <w:tblLook w:firstColumn="1" w:firstRow="1" w:lastColumn="0" w:lastRow="0" w:noHBand="0" w:noVBand="1" w:val="04A0"/>
-      </w:tblPr>
-      <w:tblGrid>
-        <w:gridCol w:w="5328"/>
-        <w:gridCol w:w="5328"/>
-      </w:tblGrid>
-      <w:tr>
-        <w:trPr>
-          <w:tblHeader w:val="true"/>
-          <w:cantSplit/>
-        </w:trPr>
-        <w:tc>
-          <w:tcPr>
-            <w:tcW w:type="dxa" w:w="5328"/>
-            <w:vAlign w:val="top"/>
-            <w:shd w:fill="D9EAF7"/>
-          </w:tcPr>
-          <w:p>
-            <w:r/>
-            <w:r>
-              <w:rPr>
-                <w:b/>
-                <w:sz w:val="17"/>
-              </w:rPr>
-              <w:t>Phase</w:t>
-            </w:r>
-          </w:p>
-        </w:tc>
-        <w:tc>
-          <w:tcPr>
-            <w:tcW w:type="dxa" w:w="5328"/>
-            <w:vAlign w:val="top"/>
-            <w:shd w:fill="D9EAF7"/>
-          </w:tcPr>
-          <w:p>
-            <w:r/>
-            <w:r>
-              <w:rPr>
-                <w:b/>
-                <w:sz w:val="17"/>
-              </w:rPr>
-              <w:t>Action</w:t>
-            </w:r>
-          </w:p>
-        </w:tc>
-      </w:tr>
-      <w:tr>
-        <w:trPr>
-          <w:cantSplit/>
-        </w:trPr>
-        <w:tc>
-          <w:tcPr>
-            <w:tcW w:type="dxa" w:w="5328"/>
-            <w:vAlign w:val="top"/>
-          </w:tcPr>
-          <w:p>
-            <w:r/>
-            <w:r>
-              <w:rPr>
-                <w:b w:val="0"/>
-                <w:sz w:val="17"/>
-              </w:rPr>
-              <w:t>Pre-upgrade</w:t>
-            </w:r>
-          </w:p>
-        </w:tc>
-        <w:tc>
-          <w:tcPr>
-            <w:tcW w:type="dxa" w:w="5328"/>
-            <w:vAlign w:val="top"/>
-          </w:tcPr>
-          <w:p>
-            <w:r/>
-            <w:r>
-              <w:rPr>
-                <w:b w:val="0"/>
-                <w:sz w:val="17"/>
-              </w:rPr>
-              <w:t>Confirm current commit, back up database/volumes, export dashboard changes, record .env keys without exposing values.</w:t>
-            </w:r>
-          </w:p>
-        </w:tc>
-      </w:tr>
-      <w:tr>
-        <w:trPr>
-          <w:cantSplit/>
-        </w:trPr>
-        <w:tc>
-          <w:tcPr>
-            <w:tcW w:type="dxa" w:w="5328"/>
-            <w:vAlign w:val="top"/>
-          </w:tcPr>
-          <w:p>
-            <w:r/>
-            <w:r>
-              <w:rPr>
-                <w:b w:val="0"/>
-                <w:sz w:val="17"/>
-              </w:rPr>
-              <w:t>Build</w:t>
-            </w:r>
-          </w:p>
-        </w:tc>
-        <w:tc>
-          <w:tcPr>
-            <w:tcW w:type="dxa" w:w="5328"/>
-            <w:vAlign w:val="top"/>
-          </w:tcPr>
-          <w:p>
-            <w:r/>
-            <w:r>
-              <w:rPr>
-                <w:b w:val="0"/>
-                <w:sz w:val="17"/>
-              </w:rPr>
-              <w:t>docker compose build after pulling source changes or switching approved delivery bundles.</w:t>
-            </w:r>
-          </w:p>
-        </w:tc>
-      </w:tr>
-      <w:tr>
-        <w:trPr>
-          <w:cantSplit/>
-        </w:trPr>
-        <w:tc>
-          <w:tcPr>
-            <w:tcW w:type="dxa" w:w="5328"/>
-            <w:vAlign w:val="top"/>
-          </w:tcPr>
-          <w:p>
-            <w:r/>
-            <w:r>
-              <w:rPr>
-                <w:b w:val="0"/>
-                <w:sz w:val="17"/>
-              </w:rPr>
-              <w:t>Redeploy</w:t>
-            </w:r>
-          </w:p>
-        </w:tc>
-        <w:tc>
-          <w:tcPr>
-            <w:tcW w:type="dxa" w:w="5328"/>
-            <w:vAlign w:val="top"/>
-          </w:tcPr>
-          <w:p>
-            <w:r/>
-            <w:r>
-              <w:rPr>
-                <w:b w:val="0"/>
-                <w:sz w:val="17"/>
-              </w:rPr>
-              <w:t>docker compose up -d; use --wait when supported by Docker Compose.</w:t>
-            </w:r>
-          </w:p>
-        </w:tc>
-      </w:tr>
-      <w:tr>
-        <w:trPr>
-          <w:cantSplit/>
-        </w:trPr>
-        <w:tc>
-          <w:tcPr>
-            <w:tcW w:type="dxa" w:w="5328"/>
-            <w:vAlign w:val="top"/>
-          </w:tcPr>
-          <w:p>
-            <w:pPr>
-              <w:keepNext/>
-            </w:pPr>
-            <w:r/>
-            <w:r>
-              <w:rPr>
-                <w:b w:val="0"/>
-                <w:sz w:val="17"/>
-              </w:rPr>
-              <w:t>Smoke test</w:t>
-            </w:r>
-          </w:p>
-        </w:tc>
-        <w:tc>
-          <w:tcPr>
-            <w:tcW w:type="dxa" w:w="5328"/>
-            <w:vAlign w:val="top"/>
-          </w:tcPr>
-          <w:p>
-            <w:pPr>
-              <w:keepNext/>
-            </w:pPr>
-            <w:r/>
-            <w:r>
-              <w:rPr>
-                <w:b w:val="0"/>
-                <w:sz w:val="17"/>
-              </w:rPr>
-              <w:t>Run docker compose ps, service logs, /health endpoints, analytics /api/v1/health, and verify.sh when services are running.</w:t>
-            </w:r>
-          </w:p>
-        </w:tc>
-      </w:tr>
-      <w:tr>
-        <w:trPr>
-          <w:cantSplit/>
-        </w:trPr>
-        <w:tc>
-          <w:tcPr>
-            <w:tcW w:type="dxa" w:w="5328"/>
-            <w:vAlign w:val="top"/>
-          </w:tcPr>
-          <w:p>
-            <w:r/>
-            <w:r>
-              <w:rPr>
-                <w:b w:val="0"/>
-                <w:sz w:val="17"/>
-              </w:rPr>
-              <w:t>Rollback</w:t>
-            </w:r>
-          </w:p>
-        </w:tc>
-        <w:tc>
-          <w:tcPr>
-            <w:tcW w:type="dxa" w:w="5328"/>
-            <w:vAlign w:val="top"/>
-          </w:tcPr>
-          <w:p>
-            <w:r/>
-            <w:r>
-              <w:rPr>
-                <w:b w:val="0"/>
-                <w:sz w:val="17"/>
-              </w:rPr>
-              <w:t>Return to the previous commit or approved delivery version and restore volumes/database backup if schema/data changed.</w:t>
-            </w:r>
-          </w:p>
-        </w:tc>
-      </w:tr>
-    </w:tbl>
-    <w:p/>
-    <w:p>
-      <w:pPr>
-        <w:pStyle w:val="Heading1"/>
-      </w:pPr>
-      <w:r>
-        <w:t>Troubleshooting Commands</w:t>
+        <w:t>The production tree provides persistent volumes and tracked dashboard/flow configuration, but it does not provide a complete universal backup/restore automation. Operators should implement tested backup procedures before production data is at risk.</w:t>
       </w:r>
     </w:p>
     <w:p>
       <w:r>
-        <w:t>These commands are safe static/live inspection commands when run by an operator with Docker access. They should not delete volumes or modify runtime state.</w:t>
+        <w:t>The backup table identifies the assets that must be protected before upgrades, destructive cleanup, or production use.</w:t>
       </w:r>
     </w:p>
     <w:tbl>
@@ -5225,7 +4695,7 @@
                 <w:b/>
                 <w:sz w:val="17"/>
               </w:rPr>
-              <w:t>Purpose</w:t>
+              <w:t>Area</w:t>
             </w:r>
           </w:p>
         </w:tc>
@@ -5242,7 +4712,7 @@
                 <w:b/>
                 <w:sz w:val="17"/>
               </w:rPr>
-              <w:t>Command</w:t>
+              <w:t>Recommended handling</w:t>
             </w:r>
           </w:p>
         </w:tc>
@@ -5259,7 +4729,7 @@
                 <w:b/>
                 <w:sz w:val="17"/>
               </w:rPr>
-              <w:t>Use</w:t>
+              <w:t>Caution</w:t>
             </w:r>
           </w:p>
         </w:tc>
@@ -5280,7 +4750,7 @@
                 <w:b w:val="0"/>
                 <w:sz w:val="17"/>
               </w:rPr>
-              <w:t>List service state</w:t>
+              <w:t>PostgreSQL/TimescaleDB</w:t>
             </w:r>
           </w:p>
         </w:tc>
@@ -5296,7 +4766,7 @@
                 <w:b w:val="0"/>
                 <w:sz w:val="17"/>
               </w:rPr>
-              <w:t>docker compose ps</w:t>
+              <w:t>Use pg_dump/pg_restore or platform database backups before upgrades and before docker compose down -v.</w:t>
             </w:r>
           </w:p>
         </w:tc>
@@ -5312,7 +4782,7 @@
                 <w:b w:val="0"/>
                 <w:sz w:val="17"/>
               </w:rPr>
-              <w:t>Shows container state, health, and exposed ports.</w:t>
+              <w:t>No tracked generic database backup script exists in production.</w:t>
             </w:r>
           </w:p>
         </w:tc>
@@ -5333,7 +4803,7 @@
                 <w:b w:val="0"/>
                 <w:sz w:val="17"/>
               </w:rPr>
-              <w:t>Inspect logs</w:t>
+              <w:t>Grafana dashboards</w:t>
             </w:r>
           </w:p>
         </w:tc>
@@ -5349,7 +4819,7 @@
                 <w:b w:val="0"/>
                 <w:sz w:val="17"/>
               </w:rPr>
-              <w:t>docker compose logs &lt;service&gt; --tail=100</w:t>
+              <w:t>Keep intended dashboard JSON under grafana/dashboards and provisioning under grafana/provisioning.</w:t>
             </w:r>
           </w:p>
         </w:tc>
@@ -5365,7 +4835,7 @@
                 <w:b w:val="0"/>
                 <w:sz w:val="17"/>
               </w:rPr>
-              <w:t>Use owning service first: nginx, analytics, postgres, mqtt, nodered, grafana, auth-service, chatbot, rasa.</w:t>
+              <w:t>Back up runtime edits before replacing Grafana volumes.</w:t>
             </w:r>
           </w:p>
         </w:tc>
@@ -5386,7 +4856,7 @@
                 <w:b w:val="0"/>
                 <w:sz w:val="17"/>
               </w:rPr>
-              <w:t>Validate configuration</w:t>
+              <w:t>Node-RED flows</w:t>
             </w:r>
           </w:p>
         </w:tc>
@@ -5402,7 +4872,7 @@
                 <w:b w:val="0"/>
                 <w:sz w:val="17"/>
               </w:rPr>
-              <w:t>docker compose config --quiet</w:t>
+              <w:t>nodered/data/flows.json is tracked; credential-bearing runtime files should not be published.</w:t>
             </w:r>
           </w:p>
         </w:tc>
@@ -5418,7 +4888,7 @@
                 <w:b w:val="0"/>
                 <w:sz w:val="17"/>
               </w:rPr>
-              <w:t>Catches Compose syntax/interpolation errors.</w:t>
+              <w:t>Credential files are excluded from documentation.</w:t>
             </w:r>
           </w:p>
         </w:tc>
@@ -5433,13 +4903,16 @@
             <w:vAlign w:val="top"/>
           </w:tcPr>
           <w:p>
+            <w:pPr>
+              <w:keepNext/>
+            </w:pPr>
             <w:r/>
             <w:r>
               <w:rPr>
                 <w:b w:val="0"/>
                 <w:sz w:val="17"/>
               </w:rPr>
-              <w:t>Gateway health</w:t>
+              <w:t>Docker volumes</w:t>
             </w:r>
           </w:p>
         </w:tc>
@@ -5449,13 +4922,16 @@
             <w:vAlign w:val="top"/>
           </w:tcPr>
           <w:p>
+            <w:pPr>
+              <w:keepNext/>
+            </w:pPr>
             <w:r/>
             <w:r>
               <w:rPr>
                 <w:b w:val="0"/>
                 <w:sz w:val="17"/>
               </w:rPr>
-              <w:t>curl -fsS http://localhost:8080/health</w:t>
+              <w:t>postgres-data, grafana-data, mqtt data/logs, redis-data, Node-RED data</w:t>
             </w:r>
           </w:p>
         </w:tc>
@@ -5465,13 +4941,16 @@
             <w:vAlign w:val="top"/>
           </w:tcPr>
           <w:p>
+            <w:pPr>
+              <w:keepNext/>
+            </w:pPr>
             <w:r/>
             <w:r>
               <w:rPr>
                 <w:b w:val="0"/>
                 <w:sz w:val="17"/>
               </w:rPr>
-              <w:t>Expected healthy response from Nginx when stack is running.</w:t>
+              <w:t>Volume deletion is destructive.</w:t>
             </w:r>
           </w:p>
         </w:tc>
@@ -5486,16 +4965,13 @@
             <w:vAlign w:val="top"/>
           </w:tcPr>
           <w:p>
-            <w:pPr>
-              <w:keepNext/>
-            </w:pPr>
             <w:r/>
             <w:r>
               <w:rPr>
                 <w:b w:val="0"/>
                 <w:sz w:val="17"/>
               </w:rPr>
-              <w:t>Analytics health</w:t>
+              <w:t>Documentation package</w:t>
             </w:r>
           </w:p>
         </w:tc>
@@ -5505,16 +4981,13 @@
             <w:vAlign w:val="top"/>
           </w:tcPr>
           <w:p>
-            <w:pPr>
-              <w:keepNext/>
-            </w:pPr>
             <w:r/>
             <w:r>
               <w:rPr>
                 <w:b w:val="0"/>
                 <w:sz w:val="17"/>
               </w:rPr>
-              <w:t>curl -fsS http://localhost:8001/api/v1/health</w:t>
+              <w:t>Regenerate DOCX from docs/final-delivery/source/generate_delivery_docs.py and source Markdown/assets.</w:t>
             </w:r>
           </w:p>
         </w:tc>
@@ -5524,86 +4997,40 @@
             <w:vAlign w:val="top"/>
           </w:tcPr>
           <w:p>
-            <w:pPr>
-              <w:keepNext/>
-            </w:pPr>
             <w:r/>
             <w:r>
               <w:rPr>
                 <w:b w:val="0"/>
                 <w:sz w:val="17"/>
               </w:rPr>
-              <w:t>Checks analytics service directly.</w:t>
-            </w:r>
-          </w:p>
-        </w:tc>
-      </w:tr>
-      <w:tr>
-        <w:trPr>
-          <w:cantSplit/>
-        </w:trPr>
-        <w:tc>
-          <w:tcPr>
-            <w:tcW w:type="dxa" w:w="3552"/>
-            <w:vAlign w:val="top"/>
-          </w:tcPr>
-          <w:p>
-            <w:r/>
-            <w:r>
-              <w:rPr>
-                <w:b w:val="0"/>
-                <w:sz w:val="17"/>
-              </w:rPr>
-              <w:t>Verification script</w:t>
-            </w:r>
-          </w:p>
-        </w:tc>
-        <w:tc>
-          <w:tcPr>
-            <w:tcW w:type="dxa" w:w="3552"/>
-            <w:vAlign w:val="top"/>
-          </w:tcPr>
-          <w:p>
-            <w:r/>
-            <w:r>
-              <w:rPr>
-                <w:b w:val="0"/>
-                <w:sz w:val="17"/>
-              </w:rPr>
-              <w:t>HUMANERDIA_BASE_URL=... ANALYTICS_BASE_URL=... OVOS_BASE_URL=... ./verify.sh</w:t>
-            </w:r>
-          </w:p>
-        </w:tc>
-        <w:tc>
-          <w:tcPr>
-            <w:tcW w:type="dxa" w:w="3552"/>
-            <w:vAlign w:val="top"/>
-          </w:tcPr>
-          <w:p>
-            <w:r/>
-            <w:r>
-              <w:rPr>
-                <w:b w:val="0"/>
-                <w:sz w:val="17"/>
-              </w:rPr>
-              <w:t>Runs live checks; skips OVOS if bridge is unreachable.</w:t>
+              <w:t>Keeps source and deliverables reproducible.</w:t>
             </w:r>
           </w:p>
         </w:tc>
       </w:tr>
     </w:tbl>
     <w:p/>
+    <w:p>
+      <w:r>
+        <w:t>The backup view identifies where durable operational state lives. Production use should include tested restoration, not only backup creation.</w:t>
+      </w:r>
+    </w:p>
     <w:p>
       <w:pPr>
         <w:pStyle w:val="Heading1"/>
       </w:pPr>
       <w:r>
-        <w:t>Production Hardening Checklist</w:t>
+        <w:t>Upgrade And Redeployment</w:t>
       </w:r>
     </w:p>
     <w:p>
       <w:r>
-        <w:t>The checklist below is intentionally phrased as operator action. The repository provides hooks and configuration, but production hardening is not complete until these actions are performed in the target environment.</w:t>
+        <w:t>Redeployment should be treated as a controlled change. Take backups, rebuild images, restart services, and run smoke checks. If schema/data changes are introduced in future versions, rollback must include database/volume strategy, not only Git checkout.</w:t>
+      </w:r>
+    </w:p>
+    <w:p>
+      <w:r>
+        <w:t>The redeployment table describes a controlled operator sequence for updating the system.</w:t>
       </w:r>
     </w:p>
     <w:tbl>
@@ -5635,7 +5062,7 @@
                 <w:b/>
                 <w:sz w:val="17"/>
               </w:rPr>
-              <w:t>Area</w:t>
+              <w:t>Phase</w:t>
             </w:r>
           </w:p>
         </w:tc>
@@ -5652,7 +5079,7 @@
                 <w:b/>
                 <w:sz w:val="17"/>
               </w:rPr>
-              <w:t>Required action</w:t>
+              <w:t>Action</w:t>
             </w:r>
           </w:p>
         </w:tc>
@@ -5673,7 +5100,7 @@
                 <w:b w:val="0"/>
                 <w:sz w:val="17"/>
               </w:rPr>
-              <w:t>Credentials</w:t>
+              <w:t>Pre-upgrade</w:t>
             </w:r>
           </w:p>
         </w:tc>
@@ -5689,7 +5116,7 @@
                 <w:b w:val="0"/>
                 <w:sz w:val="17"/>
               </w:rPr>
-              <w:t>Rotate generated setup secrets; use strong admin, database, Redis, MQTT, JWT, API, and Node-RED values.</w:t>
+              <w:t>Confirm current commit, back up database/volumes, export dashboard changes, record .env keys without exposing values.</w:t>
             </w:r>
           </w:p>
         </w:tc>
@@ -5710,7 +5137,7 @@
                 <w:b w:val="0"/>
                 <w:sz w:val="17"/>
               </w:rPr>
-              <w:t>Network exposure</w:t>
+              <w:t>Build</w:t>
             </w:r>
           </w:p>
         </w:tc>
@@ -5726,7 +5153,7 @@
                 <w:b w:val="0"/>
                 <w:sz w:val="17"/>
               </w:rPr>
-              <w:t>Restrict direct service ports; expose only intended Nginx/TLS routes to external users.</w:t>
+              <w:t>docker compose build after pulling source changes or switching approved delivery bundles.</w:t>
             </w:r>
           </w:p>
         </w:tc>
@@ -5747,7 +5174,7 @@
                 <w:b w:val="0"/>
                 <w:sz w:val="17"/>
               </w:rPr>
-              <w:t>TLS</w:t>
+              <w:t>Redeploy</w:t>
             </w:r>
           </w:p>
         </w:tc>
@@ -5763,7 +5190,7 @@
                 <w:b w:val="0"/>
                 <w:sz w:val="17"/>
               </w:rPr>
-              <w:t>Configure certificates in Nginx or an upstream reverse proxy before internet-facing use.</w:t>
+              <w:t>docker compose up -d; use --wait when supported by Docker Compose.</w:t>
             </w:r>
           </w:p>
         </w:tc>
@@ -5778,13 +5205,16 @@
             <w:vAlign w:val="top"/>
           </w:tcPr>
           <w:p>
+            <w:pPr>
+              <w:keepNext/>
+            </w:pPr>
             <w:r/>
             <w:r>
               <w:rPr>
                 <w:b w:val="0"/>
                 <w:sz w:val="17"/>
               </w:rPr>
-              <w:t>Runtime users</w:t>
+              <w:t>Smoke test</w:t>
             </w:r>
           </w:p>
         </w:tc>
@@ -5794,13 +5224,16 @@
             <w:vAlign w:val="top"/>
           </w:tcPr>
           <w:p>
+            <w:pPr>
+              <w:keepNext/>
+            </w:pPr>
             <w:r/>
             <w:r>
               <w:rPr>
                 <w:b w:val="0"/>
                 <w:sz w:val="17"/>
               </w:rPr>
-              <w:t>Review container users and file permissions; OVOS Dockerfile creates a non-root ovos user.</w:t>
+              <w:t>Run docker compose ps, service logs, /health endpoints, analytics /api/v1/health, and verify.sh when services are running.</w:t>
             </w:r>
           </w:p>
         </w:tc>
@@ -5821,7 +5254,7 @@
                 <w:b w:val="0"/>
                 <w:sz w:val="17"/>
               </w:rPr>
-              <w:t>Backups</w:t>
+              <w:t>Rollback</w:t>
             </w:r>
           </w:p>
         </w:tc>
@@ -5837,104 +5270,34 @@
                 <w:b w:val="0"/>
                 <w:sz w:val="17"/>
               </w:rPr>
-              <w:t>Implement tested backup/restore for database, dashboard changes, and operational volumes.</w:t>
-            </w:r>
-          </w:p>
-        </w:tc>
-      </w:tr>
-      <w:tr>
-        <w:trPr>
-          <w:cantSplit/>
-        </w:trPr>
-        <w:tc>
-          <w:tcPr>
-            <w:tcW w:type="dxa" w:w="5328"/>
-            <w:vAlign w:val="top"/>
-          </w:tcPr>
-          <w:p>
-            <w:pPr>
-              <w:keepNext/>
-            </w:pPr>
-            <w:r/>
-            <w:r>
-              <w:rPr>
-                <w:b w:val="0"/>
-                <w:sz w:val="17"/>
-              </w:rPr>
-              <w:t>Monitoring</w:t>
-            </w:r>
-          </w:p>
-        </w:tc>
-        <w:tc>
-          <w:tcPr>
-            <w:tcW w:type="dxa" w:w="5328"/>
-            <w:vAlign w:val="top"/>
-          </w:tcPr>
-          <w:p>
-            <w:pPr>
-              <w:keepNext/>
-            </w:pPr>
-            <w:r/>
-            <w:r>
-              <w:rPr>
-                <w:b w:val="0"/>
-                <w:sz w:val="17"/>
-              </w:rPr>
-              <w:t>Add external monitoring/log collection for health endpoints, disk usage, restart counts, and data freshness.</w:t>
-            </w:r>
-          </w:p>
-        </w:tc>
-      </w:tr>
-      <w:tr>
-        <w:trPr>
-          <w:cantSplit/>
-        </w:trPr>
-        <w:tc>
-          <w:tcPr>
-            <w:tcW w:type="dxa" w:w="5328"/>
-            <w:vAlign w:val="top"/>
-          </w:tcPr>
-          <w:p>
-            <w:r/>
-            <w:r>
-              <w:rPr>
-                <w:b w:val="0"/>
-                <w:sz w:val="17"/>
-              </w:rPr>
-              <w:t>Secrets hygiene</w:t>
-            </w:r>
-          </w:p>
-        </w:tc>
-        <w:tc>
-          <w:tcPr>
-            <w:tcW w:type="dxa" w:w="5328"/>
-            <w:vAlign w:val="top"/>
-          </w:tcPr>
-          <w:p>
-            <w:r/>
-            <w:r>
-              <w:rPr>
-                <w:b w:val="0"/>
-                <w:sz w:val="17"/>
-              </w:rPr>
-              <w:t>Never publish .env, runtime credential files, tokens, database dumps, or logs containing credentials.</w:t>
+              <w:t>Return to the previous commit or approved delivery version and restore volumes/database backup if schema/data changed.</w:t>
             </w:r>
           </w:p>
         </w:tc>
       </w:tr>
     </w:tbl>
     <w:p/>
+    <w:p>
+      <w:r>
+        <w:t>The redeployment sequence reduces risk by pairing source changes with backup, rebuild, smoke-test, and rollback planning.</w:t>
+      </w:r>
+    </w:p>
     <w:p>
       <w:pPr>
         <w:pStyle w:val="Heading1"/>
       </w:pPr>
       <w:r>
-        <w:t>Troubleshooting Scenarios</w:t>
+        <w:t>Troubleshooting Commands</w:t>
       </w:r>
     </w:p>
     <w:p>
       <w:r>
-        <w:t>The repository provides deployment-oriented defaults, placeholders, health checks, and hardening notes, but it should not be represented as automatically production-hardened. Operator action is required for DNS, TLS, firewall restrictions, credential rotation, backups, and monitoring policy.</w:t>
+        <w:t>These commands are safe static/live inspection commands when run by an operator with Docker access. They should not delete volumes or modify runtime state.</w:t>
+      </w:r>
+    </w:p>
+    <w:p>
+      <w:r>
+        <w:t>The troubleshooting command table lists safe inspection commands for diagnosing a running deployment.</w:t>
       </w:r>
     </w:p>
     <w:tbl>
@@ -5967,7 +5330,7 @@
                 <w:b/>
                 <w:sz w:val="17"/>
               </w:rPr>
-              <w:t>Symptom</w:t>
+              <w:t>Purpose</w:t>
             </w:r>
           </w:p>
         </w:tc>
@@ -5984,7 +5347,7 @@
                 <w:b/>
                 <w:sz w:val="17"/>
               </w:rPr>
-              <w:t>Likely area</w:t>
+              <w:t>Command</w:t>
             </w:r>
           </w:p>
         </w:tc>
@@ -6001,7 +5364,7 @@
                 <w:b/>
                 <w:sz w:val="17"/>
               </w:rPr>
-              <w:t>First checks</w:t>
+              <w:t>Use</w:t>
             </w:r>
           </w:p>
         </w:tc>
@@ -6022,7 +5385,7 @@
                 <w:b w:val="0"/>
                 <w:sz w:val="17"/>
               </w:rPr>
-              <w:t>Portal does not load</w:t>
+              <w:t>List service state</w:t>
             </w:r>
           </w:p>
         </w:tc>
@@ -6038,7 +5401,7 @@
                 <w:b w:val="0"/>
                 <w:sz w:val="17"/>
               </w:rPr>
-              <w:t>Nginx or portal static files</w:t>
+              <w:t>docker compose ps</w:t>
             </w:r>
           </w:p>
         </w:tc>
@@ -6054,7 +5417,7 @@
                 <w:b w:val="0"/>
                 <w:sz w:val="17"/>
               </w:rPr>
-              <w:t>curl /health; docker compose logs nginx</w:t>
+              <w:t>Shows container state, health, and exposed ports.</w:t>
             </w:r>
           </w:p>
         </w:tc>
@@ -6075,7 +5438,7 @@
                 <w:b w:val="0"/>
                 <w:sz w:val="17"/>
               </w:rPr>
-              <w:t>Analytics API returns 500</w:t>
+              <w:t>Inspect logs</w:t>
             </w:r>
           </w:p>
         </w:tc>
@@ -6091,7 +5454,7 @@
                 <w:b w:val="0"/>
                 <w:sz w:val="17"/>
               </w:rPr>
-              <w:t>Analytics, PostgreSQL, Redis</w:t>
+              <w:t>docker compose logs &lt;service&gt; --tail=100</w:t>
             </w:r>
           </w:p>
         </w:tc>
@@ -6107,7 +5470,7 @@
                 <w:b w:val="0"/>
                 <w:sz w:val="17"/>
               </w:rPr>
-              <w:t>logs for analytics/postgres/redis; /api/v1/health</w:t>
+              <w:t>Use owning service first: nginx, analytics, postgres, mqtt, nodered, grafana, auth-service, chatbot, rasa.</w:t>
             </w:r>
           </w:p>
         </w:tc>
@@ -6128,7 +5491,7 @@
                 <w:b w:val="0"/>
                 <w:sz w:val="17"/>
               </w:rPr>
-              <w:t>No new telemetry</w:t>
+              <w:t>Validate configuration</w:t>
             </w:r>
           </w:p>
         </w:tc>
@@ -6144,7 +5507,7 @@
                 <w:b w:val="0"/>
                 <w:sz w:val="17"/>
               </w:rPr>
-              <w:t>Simulator, MQTT, Node-RED</w:t>
+              <w:t>docker compose config --quiet</w:t>
             </w:r>
           </w:p>
         </w:tc>
@@ -6160,7 +5523,7 @@
                 <w:b w:val="0"/>
                 <w:sz w:val="17"/>
               </w:rPr>
-              <w:t>logs for simulator/mqtt/nodered; Node-RED flow status</w:t>
+              <w:t>Catches Compose syntax/interpolation errors.</w:t>
             </w:r>
           </w:p>
         </w:tc>
@@ -6181,7 +5544,7 @@
                 <w:b w:val="0"/>
                 <w:sz w:val="17"/>
               </w:rPr>
-              <w:t>Grafana unavailable</w:t>
+              <w:t>Gateway health</w:t>
             </w:r>
           </w:p>
         </w:tc>
@@ -6197,7 +5560,7 @@
                 <w:b w:val="0"/>
                 <w:sz w:val="17"/>
               </w:rPr>
-              <w:t>Grafana or database</w:t>
+              <w:t>curl -fsS http://localhost:8080/health</w:t>
             </w:r>
           </w:p>
         </w:tc>
@@ -6213,7 +5576,7 @@
                 <w:b w:val="0"/>
                 <w:sz w:val="17"/>
               </w:rPr>
-              <w:t>Grafana health endpoint; credentials and volume status</w:t>
+              <w:t>Expected healthy response from Nginx when stack is running.</w:t>
             </w:r>
           </w:p>
         </w:tc>
@@ -6237,7 +5600,7 @@
                 <w:b w:val="0"/>
                 <w:sz w:val="17"/>
               </w:rPr>
-              <w:t>Auth errors</w:t>
+              <w:t>Analytics health</w:t>
             </w:r>
           </w:p>
         </w:tc>
@@ -6256,7 +5619,7 @@
                 <w:b w:val="0"/>
                 <w:sz w:val="17"/>
               </w:rPr>
-              <w:t>auth-service, database, SMTP</w:t>
+              <w:t>curl -fsS http://localhost:8001/api/v1/health</w:t>
             </w:r>
           </w:p>
         </w:tc>
@@ -6275,7 +5638,7 @@
                 <w:b w:val="0"/>
                 <w:sz w:val="17"/>
               </w:rPr>
-              <w:t>/api/auth/health; auth-service logs</w:t>
+              <w:t>Checks analytics service directly.</w:t>
             </w:r>
           </w:p>
         </w:tc>
@@ -6296,7 +5659,7 @@
                 <w:b w:val="0"/>
                 <w:sz w:val="17"/>
               </w:rPr>
-              <w:t>OVOS voice path unavailable</w:t>
+              <w:t>Verification script</w:t>
             </w:r>
           </w:p>
         </w:tc>
@@ -6312,7 +5675,7 @@
                 <w:b w:val="0"/>
                 <w:sz w:val="17"/>
               </w:rPr>
-              <w:t>OVOS bridge/messagebus or analytics proxy</w:t>
+              <w:t>HUMANERDIA_BASE_URL=... ANALYTICS_BASE_URL=... OVOS_BASE_URL=... ./verify.sh</w:t>
             </w:r>
           </w:p>
         </w:tc>
@@ -6328,24 +5691,34 @@
                 <w:b w:val="0"/>
                 <w:sz w:val="17"/>
               </w:rPr>
-              <w:t>OVOS /health; analytics /api/v1/ovos/voice/health</w:t>
+              <w:t>Runs live checks; skips OVOS if bridge is unreachable.</w:t>
             </w:r>
           </w:p>
         </w:tc>
       </w:tr>
     </w:tbl>
     <w:p/>
+    <w:p>
+      <w:r>
+        <w:t>These commands let operators inspect runtime state without deleting data or changing configuration.</w:t>
+      </w:r>
+    </w:p>
     <w:p>
       <w:pPr>
         <w:pStyle w:val="Heading1"/>
       </w:pPr>
       <w:r>
-        <w:t>Limitations And Assumptions</w:t>
+        <w:t>Production Hardening Checklist</w:t>
       </w:r>
     </w:p>
     <w:p>
       <w:r>
-        <w:t>The following items should be reviewed before stakeholder distribution. They are documented to avoid overstating the current implementation.</w:t>
+        <w:t>The checklist below is intentionally phrased as operator action. The repository provides hooks and configuration, but production hardening is not complete until these actions are performed in the target environment.</w:t>
+      </w:r>
+    </w:p>
+    <w:p>
+      <w:r>
+        <w:t>The hardening table converts deployment risk areas into operator actions for production readiness.</w:t>
       </w:r>
     </w:p>
     <w:tbl>
@@ -6377,7 +5750,7 @@
                 <w:b/>
                 <w:sz w:val="17"/>
               </w:rPr>
-              <w:t>Item</w:t>
+              <w:t>Area</w:t>
             </w:r>
           </w:p>
         </w:tc>
@@ -6394,7 +5767,7 @@
                 <w:b/>
                 <w:sz w:val="17"/>
               </w:rPr>
-              <w:t>Status</w:t>
+              <w:t>Required action</w:t>
             </w:r>
           </w:p>
         </w:tc>
@@ -6415,7 +5788,7 @@
                 <w:b w:val="0"/>
                 <w:sz w:val="17"/>
               </w:rPr>
-              <w:t>Runtime verification</w:t>
+              <w:t>Credentials</w:t>
             </w:r>
           </w:p>
         </w:tc>
@@ -6431,7 +5804,7 @@
                 <w:b w:val="0"/>
                 <w:sz w:val="17"/>
               </w:rPr>
-              <w:t>This documentation package records compose validation. Live health checks require a running deployment and are not implied unless run separately.</w:t>
+              <w:t>Rotate generated setup secrets; use strong admin, database, Redis, MQTT, JWT, API, and Node-RED values.</w:t>
             </w:r>
           </w:p>
         </w:tc>
@@ -6452,7 +5825,7 @@
                 <w:b w:val="0"/>
                 <w:sz w:val="17"/>
               </w:rPr>
-              <w:t>OVOS deployment boundary</w:t>
+              <w:t>Network exposure</w:t>
             </w:r>
           </w:p>
         </w:tc>
@@ -6468,7 +5841,7 @@
                 <w:b w:val="0"/>
                 <w:sz w:val="17"/>
               </w:rPr>
-              <w:t>The GitHub production base docker-compose.yml does not define an OVOS service. OVOS-EnMS is documented as a separate source repository and companion assistant runtime.</w:t>
+              <w:t>Restrict direct service ports; expose only intended Nginx/TLS routes to external users.</w:t>
             </w:r>
           </w:p>
         </w:tc>
@@ -6489,7 +5862,7 @@
                 <w:b w:val="0"/>
                 <w:sz w:val="17"/>
               </w:rPr>
-              <w:t>OVOS optional LLM fallback</w:t>
+              <w:t>TLS</w:t>
             </w:r>
           </w:p>
         </w:tc>
@@ -6505,7 +5878,7 @@
                 <w:b w:val="0"/>
                 <w:sz w:val="17"/>
               </w:rPr>
-              <w:t>The OVOS-EnMS Dockerfile installs LLM fallback dependencies only when INSTALL_LLM_FALLBACK=true. Model availability must be verified in the OVOS-EnMS repository/runtime.</w:t>
+              <w:t>Configure certificates in Nginx or an upstream reverse proxy before internet-facing use.</w:t>
             </w:r>
           </w:p>
         </w:tc>
@@ -6526,7 +5899,7 @@
                 <w:b w:val="0"/>
                 <w:sz w:val="17"/>
               </w:rPr>
-              <w:t>Third-party EnMS support</w:t>
+              <w:t>Runtime users</w:t>
             </w:r>
           </w:p>
         </w:tc>
@@ -6542,7 +5915,7 @@
                 <w:b w:val="0"/>
                 <w:sz w:val="17"/>
               </w:rPr>
-              <w:t>OVOS portability is through a HumanEnerDIA-compatible API or adapter/proxy, not zero-code support for arbitrary vendor APIs.</w:t>
+              <w:t>Review container users and file permissions; OVOS Dockerfile creates a non-root ovos user.</w:t>
             </w:r>
           </w:p>
         </w:tc>
@@ -6563,7 +5936,7 @@
                 <w:b w:val="0"/>
                 <w:sz w:val="17"/>
               </w:rPr>
-              <w:t>Reports V2</w:t>
+              <w:t>Backups</w:t>
             </w:r>
           </w:p>
         </w:tc>
@@ -6579,7 +5952,7 @@
                 <w:b w:val="0"/>
                 <w:sz w:val="17"/>
               </w:rPr>
-              <w:t>V2 report code is implemented, but some service calculations use derived/proportional or placeholder values; final stakeholders should review report semantics before audit use.</w:t>
+              <w:t>Implement tested backup/restore for database, dashboard changes, and operational volumes.</w:t>
             </w:r>
           </w:p>
         </w:tc>
@@ -6603,7 +5976,7 @@
                 <w:b w:val="0"/>
                 <w:sz w:val="17"/>
               </w:rPr>
-              <w:t>Simulator inventory</w:t>
+              <w:t>Monitoring</w:t>
             </w:r>
           </w:p>
         </w:tc>
@@ -6622,7 +5995,7 @@
                 <w:b w:val="0"/>
                 <w:sz w:val="17"/>
               </w:rPr>
-              <w:t>The simulator code supports boiler in addition to compressor, HVAC, motor, pump, and injection molding. One simulator info response still lists five machine types.</w:t>
+              <w:t>Add external monitoring/log collection for health endpoints, disk usage, restart counts, and data freshness.</w:t>
             </w:r>
           </w:p>
         </w:tc>
@@ -6643,7 +6016,7 @@
                 <w:b w:val="0"/>
                 <w:sz w:val="17"/>
               </w:rPr>
-              <w:t>Security posture</w:t>
+              <w:t>Secrets hygiene</w:t>
             </w:r>
           </w:p>
         </w:tc>
@@ -6659,24 +6032,455 @@
                 <w:b w:val="0"/>
                 <w:sz w:val="17"/>
               </w:rPr>
-              <w:t>The codebase provides secret placeholders, generated first-run credentials, JWT/bcrypt auth, health checks, and hardening guidance. Public production exposure still requires operator DNS/TLS/firewall/credential work.</w:t>
+              <w:t>Never publish .env, runtime credential files, tokens, database dumps, or logs containing credentials.</w:t>
             </w:r>
           </w:p>
         </w:tc>
       </w:tr>
     </w:tbl>
     <w:p/>
+    <w:p>
+      <w:r>
+        <w:t>The hardening items convert the repository's configuration hooks into production operating controls.</w:t>
+      </w:r>
+    </w:p>
     <w:p>
       <w:pPr>
         <w:pStyle w:val="Heading1"/>
       </w:pPr>
       <w:r>
-        <w:t>Source References</w:t>
+        <w:t>Troubleshooting Scenarios</w:t>
       </w:r>
     </w:p>
     <w:p>
       <w:r>
-        <w:t>The table below lists the main source material used for this document. It is not a full file inventory; it identifies the sources behind the material claims.</w:t>
+        <w:t>The repository provides deployment-oriented defaults, placeholders, health checks, and hardening notes. Production hardening is completed through operator-managed DNS, TLS, firewall restrictions, credential rotation, backups, and monitoring policy.</w:t>
+      </w:r>
+    </w:p>
+    <w:p>
+      <w:r>
+        <w:t>The scenario table connects common symptoms to the first services and checks operators should inspect.</w:t>
+      </w:r>
+    </w:p>
+    <w:tbl>
+      <w:tblPr>
+        <w:tblStyle w:val="TableGrid"/>
+        <w:tblW w:type="auto" w:w="0"/>
+        <w:jc w:val="center"/>
+        <w:tblLook w:firstColumn="1" w:firstRow="1" w:lastColumn="0" w:lastRow="0" w:noHBand="0" w:noVBand="1" w:val="04A0"/>
+      </w:tblPr>
+      <w:tblGrid>
+        <w:gridCol w:w="3552"/>
+        <w:gridCol w:w="3552"/>
+        <w:gridCol w:w="3552"/>
+      </w:tblGrid>
+      <w:tr>
+        <w:trPr>
+          <w:tblHeader w:val="true"/>
+          <w:cantSplit/>
+        </w:trPr>
+        <w:tc>
+          <w:tcPr>
+            <w:tcW w:type="dxa" w:w="3552"/>
+            <w:vAlign w:val="top"/>
+            <w:shd w:fill="D9EAF7"/>
+          </w:tcPr>
+          <w:p>
+            <w:r/>
+            <w:r>
+              <w:rPr>
+                <w:b/>
+                <w:sz w:val="17"/>
+              </w:rPr>
+              <w:t>Symptom</w:t>
+            </w:r>
+          </w:p>
+        </w:tc>
+        <w:tc>
+          <w:tcPr>
+            <w:tcW w:type="dxa" w:w="3552"/>
+            <w:vAlign w:val="top"/>
+            <w:shd w:fill="D9EAF7"/>
+          </w:tcPr>
+          <w:p>
+            <w:r/>
+            <w:r>
+              <w:rPr>
+                <w:b/>
+                <w:sz w:val="17"/>
+              </w:rPr>
+              <w:t>Likely area</w:t>
+            </w:r>
+          </w:p>
+        </w:tc>
+        <w:tc>
+          <w:tcPr>
+            <w:tcW w:type="dxa" w:w="3552"/>
+            <w:vAlign w:val="top"/>
+            <w:shd w:fill="D9EAF7"/>
+          </w:tcPr>
+          <w:p>
+            <w:r/>
+            <w:r>
+              <w:rPr>
+                <w:b/>
+                <w:sz w:val="17"/>
+              </w:rPr>
+              <w:t>First checks</w:t>
+            </w:r>
+          </w:p>
+        </w:tc>
+      </w:tr>
+      <w:tr>
+        <w:trPr>
+          <w:cantSplit/>
+        </w:trPr>
+        <w:tc>
+          <w:tcPr>
+            <w:tcW w:type="dxa" w:w="3552"/>
+            <w:vAlign w:val="top"/>
+          </w:tcPr>
+          <w:p>
+            <w:r/>
+            <w:r>
+              <w:rPr>
+                <w:b w:val="0"/>
+                <w:sz w:val="17"/>
+              </w:rPr>
+              <w:t>Portal does not load</w:t>
+            </w:r>
+          </w:p>
+        </w:tc>
+        <w:tc>
+          <w:tcPr>
+            <w:tcW w:type="dxa" w:w="3552"/>
+            <w:vAlign w:val="top"/>
+          </w:tcPr>
+          <w:p>
+            <w:r/>
+            <w:r>
+              <w:rPr>
+                <w:b w:val="0"/>
+                <w:sz w:val="17"/>
+              </w:rPr>
+              <w:t>Nginx or portal static files</w:t>
+            </w:r>
+          </w:p>
+        </w:tc>
+        <w:tc>
+          <w:tcPr>
+            <w:tcW w:type="dxa" w:w="3552"/>
+            <w:vAlign w:val="top"/>
+          </w:tcPr>
+          <w:p>
+            <w:r/>
+            <w:r>
+              <w:rPr>
+                <w:b w:val="0"/>
+                <w:sz w:val="17"/>
+              </w:rPr>
+              <w:t>curl /health; docker compose logs nginx</w:t>
+            </w:r>
+          </w:p>
+        </w:tc>
+      </w:tr>
+      <w:tr>
+        <w:trPr>
+          <w:cantSplit/>
+        </w:trPr>
+        <w:tc>
+          <w:tcPr>
+            <w:tcW w:type="dxa" w:w="3552"/>
+            <w:vAlign w:val="top"/>
+          </w:tcPr>
+          <w:p>
+            <w:r/>
+            <w:r>
+              <w:rPr>
+                <w:b w:val="0"/>
+                <w:sz w:val="17"/>
+              </w:rPr>
+              <w:t>Analytics API returns 500</w:t>
+            </w:r>
+          </w:p>
+        </w:tc>
+        <w:tc>
+          <w:tcPr>
+            <w:tcW w:type="dxa" w:w="3552"/>
+            <w:vAlign w:val="top"/>
+          </w:tcPr>
+          <w:p>
+            <w:r/>
+            <w:r>
+              <w:rPr>
+                <w:b w:val="0"/>
+                <w:sz w:val="17"/>
+              </w:rPr>
+              <w:t>Analytics, PostgreSQL, Redis</w:t>
+            </w:r>
+          </w:p>
+        </w:tc>
+        <w:tc>
+          <w:tcPr>
+            <w:tcW w:type="dxa" w:w="3552"/>
+            <w:vAlign w:val="top"/>
+          </w:tcPr>
+          <w:p>
+            <w:r/>
+            <w:r>
+              <w:rPr>
+                <w:b w:val="0"/>
+                <w:sz w:val="17"/>
+              </w:rPr>
+              <w:t>logs for analytics/postgres/redis; /api/v1/health</w:t>
+            </w:r>
+          </w:p>
+        </w:tc>
+      </w:tr>
+      <w:tr>
+        <w:trPr>
+          <w:cantSplit/>
+        </w:trPr>
+        <w:tc>
+          <w:tcPr>
+            <w:tcW w:type="dxa" w:w="3552"/>
+            <w:vAlign w:val="top"/>
+          </w:tcPr>
+          <w:p>
+            <w:r/>
+            <w:r>
+              <w:rPr>
+                <w:b w:val="0"/>
+                <w:sz w:val="17"/>
+              </w:rPr>
+              <w:t>No new telemetry</w:t>
+            </w:r>
+          </w:p>
+        </w:tc>
+        <w:tc>
+          <w:tcPr>
+            <w:tcW w:type="dxa" w:w="3552"/>
+            <w:vAlign w:val="top"/>
+          </w:tcPr>
+          <w:p>
+            <w:r/>
+            <w:r>
+              <w:rPr>
+                <w:b w:val="0"/>
+                <w:sz w:val="17"/>
+              </w:rPr>
+              <w:t>Simulator, MQTT, Node-RED</w:t>
+            </w:r>
+          </w:p>
+        </w:tc>
+        <w:tc>
+          <w:tcPr>
+            <w:tcW w:type="dxa" w:w="3552"/>
+            <w:vAlign w:val="top"/>
+          </w:tcPr>
+          <w:p>
+            <w:r/>
+            <w:r>
+              <w:rPr>
+                <w:b w:val="0"/>
+                <w:sz w:val="17"/>
+              </w:rPr>
+              <w:t>logs for simulator/mqtt/nodered; Node-RED flow status</w:t>
+            </w:r>
+          </w:p>
+        </w:tc>
+      </w:tr>
+      <w:tr>
+        <w:trPr>
+          <w:cantSplit/>
+        </w:trPr>
+        <w:tc>
+          <w:tcPr>
+            <w:tcW w:type="dxa" w:w="3552"/>
+            <w:vAlign w:val="top"/>
+          </w:tcPr>
+          <w:p>
+            <w:r/>
+            <w:r>
+              <w:rPr>
+                <w:b w:val="0"/>
+                <w:sz w:val="17"/>
+              </w:rPr>
+              <w:t>Grafana unavailable</w:t>
+            </w:r>
+          </w:p>
+        </w:tc>
+        <w:tc>
+          <w:tcPr>
+            <w:tcW w:type="dxa" w:w="3552"/>
+            <w:vAlign w:val="top"/>
+          </w:tcPr>
+          <w:p>
+            <w:r/>
+            <w:r>
+              <w:rPr>
+                <w:b w:val="0"/>
+                <w:sz w:val="17"/>
+              </w:rPr>
+              <w:t>Grafana or database</w:t>
+            </w:r>
+          </w:p>
+        </w:tc>
+        <w:tc>
+          <w:tcPr>
+            <w:tcW w:type="dxa" w:w="3552"/>
+            <w:vAlign w:val="top"/>
+          </w:tcPr>
+          <w:p>
+            <w:r/>
+            <w:r>
+              <w:rPr>
+                <w:b w:val="0"/>
+                <w:sz w:val="17"/>
+              </w:rPr>
+              <w:t>Grafana health endpoint; credentials and volume status</w:t>
+            </w:r>
+          </w:p>
+        </w:tc>
+      </w:tr>
+      <w:tr>
+        <w:trPr>
+          <w:cantSplit/>
+        </w:trPr>
+        <w:tc>
+          <w:tcPr>
+            <w:tcW w:type="dxa" w:w="3552"/>
+            <w:vAlign w:val="top"/>
+          </w:tcPr>
+          <w:p>
+            <w:pPr>
+              <w:keepNext/>
+            </w:pPr>
+            <w:r/>
+            <w:r>
+              <w:rPr>
+                <w:b w:val="0"/>
+                <w:sz w:val="17"/>
+              </w:rPr>
+              <w:t>Auth errors</w:t>
+            </w:r>
+          </w:p>
+        </w:tc>
+        <w:tc>
+          <w:tcPr>
+            <w:tcW w:type="dxa" w:w="3552"/>
+            <w:vAlign w:val="top"/>
+          </w:tcPr>
+          <w:p>
+            <w:pPr>
+              <w:keepNext/>
+            </w:pPr>
+            <w:r/>
+            <w:r>
+              <w:rPr>
+                <w:b w:val="0"/>
+                <w:sz w:val="17"/>
+              </w:rPr>
+              <w:t>auth-service, database, SMTP</w:t>
+            </w:r>
+          </w:p>
+        </w:tc>
+        <w:tc>
+          <w:tcPr>
+            <w:tcW w:type="dxa" w:w="3552"/>
+            <w:vAlign w:val="top"/>
+          </w:tcPr>
+          <w:p>
+            <w:pPr>
+              <w:keepNext/>
+            </w:pPr>
+            <w:r/>
+            <w:r>
+              <w:rPr>
+                <w:b w:val="0"/>
+                <w:sz w:val="17"/>
+              </w:rPr>
+              <w:t>/api/auth/health; auth-service logs</w:t>
+            </w:r>
+          </w:p>
+        </w:tc>
+      </w:tr>
+      <w:tr>
+        <w:trPr>
+          <w:cantSplit/>
+        </w:trPr>
+        <w:tc>
+          <w:tcPr>
+            <w:tcW w:type="dxa" w:w="3552"/>
+            <w:vAlign w:val="top"/>
+          </w:tcPr>
+          <w:p>
+            <w:r/>
+            <w:r>
+              <w:rPr>
+                <w:b w:val="0"/>
+                <w:sz w:val="17"/>
+              </w:rPr>
+              <w:t>OVOS voice path unavailable</w:t>
+            </w:r>
+          </w:p>
+        </w:tc>
+        <w:tc>
+          <w:tcPr>
+            <w:tcW w:type="dxa" w:w="3552"/>
+            <w:vAlign w:val="top"/>
+          </w:tcPr>
+          <w:p>
+            <w:r/>
+            <w:r>
+              <w:rPr>
+                <w:b w:val="0"/>
+                <w:sz w:val="17"/>
+              </w:rPr>
+              <w:t>OVOS bridge/messagebus or analytics proxy</w:t>
+            </w:r>
+          </w:p>
+        </w:tc>
+        <w:tc>
+          <w:tcPr>
+            <w:tcW w:type="dxa" w:w="3552"/>
+            <w:vAlign w:val="top"/>
+          </w:tcPr>
+          <w:p>
+            <w:r/>
+            <w:r>
+              <w:rPr>
+                <w:b w:val="0"/>
+                <w:sz w:val="17"/>
+              </w:rPr>
+              <w:t>OVOS /health; analytics /api/v1/ovos/voice/health</w:t>
+            </w:r>
+          </w:p>
+        </w:tc>
+      </w:tr>
+    </w:tbl>
+    <w:p/>
+    <w:p>
+      <w:r>
+        <w:t>The scenarios help operators start diagnosis in the correct service area rather than treating the stack as a single opaque process.</w:t>
+      </w:r>
+    </w:p>
+    <w:p>
+      <w:pPr>
+        <w:pStyle w:val="Heading1"/>
+      </w:pPr>
+      <w:r>
+        <w:t>Limitations And Assumptions</w:t>
+      </w:r>
+    </w:p>
+    <w:p>
+      <w:r>
+        <w:t>This section summarizes the current validation status, scope boundaries, and operational considerations for the delivered system.</w:t>
+      </w:r>
+    </w:p>
+    <w:p>
+      <w:r>
+        <w:t>The limitations table defines scope boundaries that affect validation, audit use, optional assistant behavior, and production readiness.</w:t>
       </w:r>
     </w:p>
     <w:tbl>
@@ -6708,7 +6512,7 @@
                 <w:b/>
                 <w:sz w:val="17"/>
               </w:rPr>
-              <w:t>Topic</w:t>
+              <w:t>Item</w:t>
             </w:r>
           </w:p>
         </w:tc>
@@ -6725,7 +6529,7 @@
                 <w:b/>
                 <w:sz w:val="17"/>
               </w:rPr>
-              <w:t>Source material</w:t>
+              <w:t>Status</w:t>
             </w:r>
           </w:p>
         </w:tc>
@@ -6746,7 +6550,7 @@
                 <w:b w:val="0"/>
                 <w:sz w:val="17"/>
               </w:rPr>
-              <w:t>Base compose</w:t>
+              <w:t>Runtime verification</w:t>
             </w:r>
           </w:p>
         </w:tc>
@@ -6762,7 +6566,7 @@
                 <w:b w:val="0"/>
                 <w:sz w:val="17"/>
               </w:rPr>
-              <w:t>docker-compose.yml</w:t>
+              <w:t>Compose validation is confirmed where stated. Live health checks are deployment-specific and require a running target environment.</w:t>
             </w:r>
           </w:p>
         </w:tc>
@@ -6783,7 +6587,7 @@
                 <w:b w:val="0"/>
                 <w:sz w:val="17"/>
               </w:rPr>
-              <w:t>Setup helper</w:t>
+              <w:t>OVOS deployment boundary</w:t>
             </w:r>
           </w:p>
         </w:tc>
@@ -6799,7 +6603,7 @@
                 <w:b w:val="0"/>
                 <w:sz w:val="17"/>
               </w:rPr>
-              <w:t>setup.sh</w:t>
+              <w:t>The GitHub production base docker-compose.yml does not define an OVOS service. OVOS-EnMS is documented as a separate source repository and companion assistant runtime.</w:t>
             </w:r>
           </w:p>
         </w:tc>
@@ -6814,16 +6618,13 @@
             <w:vAlign w:val="top"/>
           </w:tcPr>
           <w:p>
-            <w:pPr>
-              <w:keepNext/>
-            </w:pPr>
             <w:r/>
             <w:r>
               <w:rPr>
                 <w:b w:val="0"/>
                 <w:sz w:val="17"/>
               </w:rPr>
-              <w:t>Verifier</w:t>
+              <w:t>OVOS optional LLM fallback</w:t>
             </w:r>
           </w:p>
         </w:tc>
@@ -6833,16 +6634,13 @@
             <w:vAlign w:val="top"/>
           </w:tcPr>
           <w:p>
-            <w:pPr>
-              <w:keepNext/>
-            </w:pPr>
             <w:r/>
             <w:r>
               <w:rPr>
                 <w:b w:val="0"/>
                 <w:sz w:val="17"/>
               </w:rPr>
-              <w:t>verify.sh</w:t>
+              <w:t>The OVOS-EnMS Dockerfile installs LLM fallback dependencies only when INSTALL_LLM_FALLBACK=true. Model availability must be verified in the OVOS-EnMS repository/runtime.</w:t>
             </w:r>
           </w:p>
         </w:tc>
@@ -6863,7 +6661,7 @@
                 <w:b w:val="0"/>
                 <w:sz w:val="17"/>
               </w:rPr>
-              <w:t>OVOS Docker</w:t>
+              <w:t>Third-party EnMS support</w:t>
             </w:r>
           </w:p>
         </w:tc>
@@ -6879,13 +6677,365 @@
                 <w:b w:val="0"/>
                 <w:sz w:val="17"/>
               </w:rPr>
-              <w:t>OVOS-EnMS repository: docker-compose.yml; Dockerfile; enms-ovos-skill/config.yaml.template; enms-ovos-skill/settings.docker.json; enms-ovos-skill/settingsmeta.yaml</w:t>
+              <w:t>OVOS portability is through a HumanEnerDIA-compatible API or adapter/proxy, not zero-code support for arbitrary vendor APIs.</w:t>
+            </w:r>
+          </w:p>
+        </w:tc>
+      </w:tr>
+      <w:tr>
+        <w:trPr>
+          <w:cantSplit/>
+        </w:trPr>
+        <w:tc>
+          <w:tcPr>
+            <w:tcW w:type="dxa" w:w="5328"/>
+            <w:vAlign w:val="top"/>
+          </w:tcPr>
+          <w:p>
+            <w:r/>
+            <w:r>
+              <w:rPr>
+                <w:b w:val="0"/>
+                <w:sz w:val="17"/>
+              </w:rPr>
+              <w:t>Reports V2</w:t>
+            </w:r>
+          </w:p>
+        </w:tc>
+        <w:tc>
+          <w:tcPr>
+            <w:tcW w:type="dxa" w:w="5328"/>
+            <w:vAlign w:val="top"/>
+          </w:tcPr>
+          <w:p>
+            <w:r/>
+            <w:r>
+              <w:rPr>
+                <w:b w:val="0"/>
+                <w:sz w:val="17"/>
+              </w:rPr>
+              <w:t>V2 report code is implemented, but some service calculations use derived, proportional, or placeholder values. Formal audit use requires independent validation of formulas, source data, tariff factors, carbon factors, and generated report semantics.</w:t>
+            </w:r>
+          </w:p>
+        </w:tc>
+      </w:tr>
+      <w:tr>
+        <w:trPr>
+          <w:cantSplit/>
+        </w:trPr>
+        <w:tc>
+          <w:tcPr>
+            <w:tcW w:type="dxa" w:w="5328"/>
+            <w:vAlign w:val="top"/>
+          </w:tcPr>
+          <w:p>
+            <w:pPr>
+              <w:keepNext/>
+            </w:pPr>
+            <w:r/>
+            <w:r>
+              <w:rPr>
+                <w:b w:val="0"/>
+                <w:sz w:val="17"/>
+              </w:rPr>
+              <w:t>Simulator inventory</w:t>
+            </w:r>
+          </w:p>
+        </w:tc>
+        <w:tc>
+          <w:tcPr>
+            <w:tcW w:type="dxa" w:w="5328"/>
+            <w:vAlign w:val="top"/>
+          </w:tcPr>
+          <w:p>
+            <w:pPr>
+              <w:keepNext/>
+            </w:pPr>
+            <w:r/>
+            <w:r>
+              <w:rPr>
+                <w:b w:val="0"/>
+                <w:sz w:val="17"/>
+              </w:rPr>
+              <w:t>The simulator code supports boiler in addition to compressor, HVAC, motor, pump, and injection molding. One simulator info response still lists five machine types.</w:t>
+            </w:r>
+          </w:p>
+        </w:tc>
+      </w:tr>
+      <w:tr>
+        <w:trPr>
+          <w:cantSplit/>
+        </w:trPr>
+        <w:tc>
+          <w:tcPr>
+            <w:tcW w:type="dxa" w:w="5328"/>
+            <w:vAlign w:val="top"/>
+          </w:tcPr>
+          <w:p>
+            <w:r/>
+            <w:r>
+              <w:rPr>
+                <w:b w:val="0"/>
+                <w:sz w:val="17"/>
+              </w:rPr>
+              <w:t>Security posture</w:t>
+            </w:r>
+          </w:p>
+        </w:tc>
+        <w:tc>
+          <w:tcPr>
+            <w:tcW w:type="dxa" w:w="5328"/>
+            <w:vAlign w:val="top"/>
+          </w:tcPr>
+          <w:p>
+            <w:r/>
+            <w:r>
+              <w:rPr>
+                <w:b w:val="0"/>
+                <w:sz w:val="17"/>
+              </w:rPr>
+              <w:t>The codebase provides secret placeholders, generated first-run credentials, JWT/bcrypt auth, health checks, and hardening guidance. Public production exposure still requires operator DNS/TLS/firewall/credential work.</w:t>
             </w:r>
           </w:p>
         </w:tc>
       </w:tr>
     </w:tbl>
     <w:p/>
+    <w:p>
+      <w:r>
+        <w:t>Together, these points define the verified scope of the current delivery and the operational responsibilities required before production use. They preserve a clear distinction between implemented capability, deployment configuration, and assurance activities that belong to the target operating environment.</w:t>
+      </w:r>
+    </w:p>
+    <w:p>
+      <w:pPr>
+        <w:pStyle w:val="Heading1"/>
+      </w:pPr>
+      <w:r>
+        <w:t>Source References</w:t>
+      </w:r>
+    </w:p>
+    <w:p>
+      <w:r>
+        <w:t>The table below lists the main source material used for this document. It is not a full file inventory; it identifies the sources behind the material claims.</w:t>
+      </w:r>
+    </w:p>
+    <w:p>
+      <w:r>
+        <w:t>The source reference table links the document's major claims to the tracked files or validation evidence used to support them.</w:t>
+      </w:r>
+    </w:p>
+    <w:tbl>
+      <w:tblPr>
+        <w:tblStyle w:val="TableGrid"/>
+        <w:tblW w:type="auto" w:w="0"/>
+        <w:jc w:val="center"/>
+        <w:tblLook w:firstColumn="1" w:firstRow="1" w:lastColumn="0" w:lastRow="0" w:noHBand="0" w:noVBand="1" w:val="04A0"/>
+      </w:tblPr>
+      <w:tblGrid>
+        <w:gridCol w:w="5328"/>
+        <w:gridCol w:w="5328"/>
+      </w:tblGrid>
+      <w:tr>
+        <w:trPr>
+          <w:tblHeader w:val="true"/>
+          <w:cantSplit/>
+        </w:trPr>
+        <w:tc>
+          <w:tcPr>
+            <w:tcW w:type="dxa" w:w="5328"/>
+            <w:vAlign w:val="top"/>
+            <w:shd w:fill="D9EAF7"/>
+          </w:tcPr>
+          <w:p>
+            <w:r/>
+            <w:r>
+              <w:rPr>
+                <w:b/>
+                <w:sz w:val="17"/>
+              </w:rPr>
+              <w:t>Topic</w:t>
+            </w:r>
+          </w:p>
+        </w:tc>
+        <w:tc>
+          <w:tcPr>
+            <w:tcW w:type="dxa" w:w="5328"/>
+            <w:vAlign w:val="top"/>
+            <w:shd w:fill="D9EAF7"/>
+          </w:tcPr>
+          <w:p>
+            <w:r/>
+            <w:r>
+              <w:rPr>
+                <w:b/>
+                <w:sz w:val="17"/>
+              </w:rPr>
+              <w:t>Source material</w:t>
+            </w:r>
+          </w:p>
+        </w:tc>
+      </w:tr>
+      <w:tr>
+        <w:trPr>
+          <w:cantSplit/>
+        </w:trPr>
+        <w:tc>
+          <w:tcPr>
+            <w:tcW w:type="dxa" w:w="5328"/>
+            <w:vAlign w:val="top"/>
+          </w:tcPr>
+          <w:p>
+            <w:r/>
+            <w:r>
+              <w:rPr>
+                <w:b w:val="0"/>
+                <w:sz w:val="17"/>
+              </w:rPr>
+              <w:t>Base compose</w:t>
+            </w:r>
+          </w:p>
+        </w:tc>
+        <w:tc>
+          <w:tcPr>
+            <w:tcW w:type="dxa" w:w="5328"/>
+            <w:vAlign w:val="top"/>
+          </w:tcPr>
+          <w:p>
+            <w:r/>
+            <w:r>
+              <w:rPr>
+                <w:b w:val="0"/>
+                <w:sz w:val="17"/>
+              </w:rPr>
+              <w:t>docker-compose.yml</w:t>
+            </w:r>
+          </w:p>
+        </w:tc>
+      </w:tr>
+      <w:tr>
+        <w:trPr>
+          <w:cantSplit/>
+        </w:trPr>
+        <w:tc>
+          <w:tcPr>
+            <w:tcW w:type="dxa" w:w="5328"/>
+            <w:vAlign w:val="top"/>
+          </w:tcPr>
+          <w:p>
+            <w:r/>
+            <w:r>
+              <w:rPr>
+                <w:b w:val="0"/>
+                <w:sz w:val="17"/>
+              </w:rPr>
+              <w:t>Setup helper</w:t>
+            </w:r>
+          </w:p>
+        </w:tc>
+        <w:tc>
+          <w:tcPr>
+            <w:tcW w:type="dxa" w:w="5328"/>
+            <w:vAlign w:val="top"/>
+          </w:tcPr>
+          <w:p>
+            <w:r/>
+            <w:r>
+              <w:rPr>
+                <w:b w:val="0"/>
+                <w:sz w:val="17"/>
+              </w:rPr>
+              <w:t>setup.sh</w:t>
+            </w:r>
+          </w:p>
+        </w:tc>
+      </w:tr>
+      <w:tr>
+        <w:trPr>
+          <w:cantSplit/>
+        </w:trPr>
+        <w:tc>
+          <w:tcPr>
+            <w:tcW w:type="dxa" w:w="5328"/>
+            <w:vAlign w:val="top"/>
+          </w:tcPr>
+          <w:p>
+            <w:pPr>
+              <w:keepNext/>
+            </w:pPr>
+            <w:r/>
+            <w:r>
+              <w:rPr>
+                <w:b w:val="0"/>
+                <w:sz w:val="17"/>
+              </w:rPr>
+              <w:t>Verifier</w:t>
+            </w:r>
+          </w:p>
+        </w:tc>
+        <w:tc>
+          <w:tcPr>
+            <w:tcW w:type="dxa" w:w="5328"/>
+            <w:vAlign w:val="top"/>
+          </w:tcPr>
+          <w:p>
+            <w:pPr>
+              <w:keepNext/>
+            </w:pPr>
+            <w:r/>
+            <w:r>
+              <w:rPr>
+                <w:b w:val="0"/>
+                <w:sz w:val="17"/>
+              </w:rPr>
+              <w:t>verify.sh</w:t>
+            </w:r>
+          </w:p>
+        </w:tc>
+      </w:tr>
+      <w:tr>
+        <w:trPr>
+          <w:cantSplit/>
+        </w:trPr>
+        <w:tc>
+          <w:tcPr>
+            <w:tcW w:type="dxa" w:w="5328"/>
+            <w:vAlign w:val="top"/>
+          </w:tcPr>
+          <w:p>
+            <w:r/>
+            <w:r>
+              <w:rPr>
+                <w:b w:val="0"/>
+                <w:sz w:val="17"/>
+              </w:rPr>
+              <w:t>OVOS Docker</w:t>
+            </w:r>
+          </w:p>
+        </w:tc>
+        <w:tc>
+          <w:tcPr>
+            <w:tcW w:type="dxa" w:w="5328"/>
+            <w:vAlign w:val="top"/>
+          </w:tcPr>
+          <w:p>
+            <w:r/>
+            <w:r>
+              <w:rPr>
+                <w:b w:val="0"/>
+                <w:sz w:val="17"/>
+              </w:rPr>
+              <w:t>OVOS-EnMS repository: docker-compose.yml; Dockerfile; enms-ovos-skill/config.yaml.template; enms-ovos-skill/settings.docker.json; enms-ovos-skill/settingsmeta.yaml</w:t>
+            </w:r>
+          </w:p>
+        </w:tc>
+      </w:tr>
+    </w:tbl>
+    <w:p/>
+    <w:p>
+      <w:r>
+        <w:t>These references provide traceability for technical claims. They are intended to support maintenance and verification without exposing secrets or local runtime state.</w:t>
+      </w:r>
+    </w:p>
     <w:sectPr>
       <w:footerReference w:type="default" r:id="rId11"/>
       <w:pgSz w:w="12240" w:h="15840"/>

</xml_diff>